<commit_message>
MFC is terrible, this should be ok
</commit_message>
<xml_diff>
--- a/WOFFCEdit/_2101007_CMP405_Documentation.docx
+++ b/WOFFCEdit/_2101007_CMP405_Documentation.docx
@@ -9,8 +9,9 @@
           <w:rFonts w:ascii="Arial" w:hAnsi="Arial" w:cs="Arial"/>
           <w:b/>
           <w:bCs/>
-          <w:sz w:val="26"/>
-          <w:szCs w:val="26"/>
+          <w:color w:val="000000" w:themeColor="text1"/>
+          <w:sz w:val="28"/>
+          <w:szCs w:val="28"/>
         </w:rPr>
       </w:pPr>
       <w:r>
@@ -18,8 +19,9 @@
           <w:rFonts w:ascii="Arial" w:hAnsi="Arial" w:cs="Arial"/>
           <w:b/>
           <w:bCs/>
-          <w:sz w:val="26"/>
-          <w:szCs w:val="26"/>
+          <w:color w:val="000000" w:themeColor="text1"/>
+          <w:sz w:val="28"/>
+          <w:szCs w:val="28"/>
         </w:rPr>
         <w:t>CMP 405 – Tools Programming</w:t>
       </w:r>
@@ -31,8 +33,9 @@
           <w:rFonts w:ascii="Arial" w:hAnsi="Arial" w:cs="Arial"/>
           <w:b/>
           <w:bCs/>
-          <w:sz w:val="26"/>
-          <w:szCs w:val="26"/>
+          <w:color w:val="000000" w:themeColor="text1"/>
+          <w:sz w:val="28"/>
+          <w:szCs w:val="28"/>
         </w:rPr>
       </w:pPr>
       <w:r>
@@ -40,8 +43,9 @@
           <w:rFonts w:ascii="Arial" w:hAnsi="Arial" w:cs="Arial"/>
           <w:b/>
           <w:bCs/>
-          <w:sz w:val="26"/>
-          <w:szCs w:val="26"/>
+          <w:color w:val="000000" w:themeColor="text1"/>
+          <w:sz w:val="28"/>
+          <w:szCs w:val="28"/>
         </w:rPr>
         <w:t>2101007</w:t>
       </w:r>
@@ -53,8 +57,9 @@
           <w:rFonts w:ascii="Arial" w:hAnsi="Arial" w:cs="Arial"/>
           <w:b/>
           <w:bCs/>
-          <w:sz w:val="26"/>
-          <w:szCs w:val="26"/>
+          <w:color w:val="000000" w:themeColor="text1"/>
+          <w:sz w:val="28"/>
+          <w:szCs w:val="28"/>
         </w:rPr>
       </w:pPr>
       <w:r>
@@ -62,8 +67,9 @@
           <w:rFonts w:ascii="Arial" w:hAnsi="Arial" w:cs="Arial"/>
           <w:b/>
           <w:bCs/>
-          <w:sz w:val="26"/>
-          <w:szCs w:val="26"/>
+          <w:color w:val="000000" w:themeColor="text1"/>
+          <w:sz w:val="28"/>
+          <w:szCs w:val="28"/>
         </w:rPr>
         <w:t>Callum Shepherd</w:t>
       </w:r>
@@ -75,8 +81,9 @@
           <w:rFonts w:ascii="Arial" w:hAnsi="Arial" w:cs="Arial"/>
           <w:b/>
           <w:bCs/>
-          <w:sz w:val="26"/>
-          <w:szCs w:val="26"/>
+          <w:color w:val="000000" w:themeColor="text1"/>
+          <w:sz w:val="28"/>
+          <w:szCs w:val="28"/>
         </w:rPr>
       </w:pPr>
       <w:r>
@@ -84,8 +91,9 @@
           <w:rFonts w:ascii="Arial" w:hAnsi="Arial" w:cs="Arial"/>
           <w:b/>
           <w:bCs/>
-          <w:sz w:val="26"/>
-          <w:szCs w:val="26"/>
+          <w:color w:val="000000" w:themeColor="text1"/>
+          <w:sz w:val="28"/>
+          <w:szCs w:val="28"/>
         </w:rPr>
         <w:t>Documentation Document</w:t>
       </w:r>
@@ -96,8 +104,9 @@
         <w:rPr>
           <w:b/>
           <w:bCs/>
-          <w:sz w:val="26"/>
-          <w:szCs w:val="26"/>
+          <w:color w:val="000000" w:themeColor="text1"/>
+          <w:sz w:val="28"/>
+          <w:szCs w:val="28"/>
         </w:rPr>
       </w:pPr>
     </w:p>
@@ -110,8 +119,8 @@
           <w:b/>
           <w:bCs/>
           <w:color w:val="000000" w:themeColor="text1"/>
-          <w:sz w:val="26"/>
-          <w:szCs w:val="26"/>
+          <w:sz w:val="28"/>
+          <w:szCs w:val="28"/>
         </w:rPr>
       </w:pPr>
       <w:r>
@@ -120,8 +129,8 @@
           <w:b/>
           <w:bCs/>
           <w:color w:val="000000" w:themeColor="text1"/>
-          <w:sz w:val="26"/>
-          <w:szCs w:val="26"/>
+          <w:sz w:val="28"/>
+          <w:szCs w:val="28"/>
         </w:rPr>
         <w:t>Summary:</w:t>
       </w:r>
@@ -131,95 +140,107 @@
         <w:spacing w:line="276" w:lineRule="auto"/>
         <w:rPr>
           <w:rFonts w:ascii="Arial" w:hAnsi="Arial" w:cs="Arial"/>
-          <w:sz w:val="26"/>
-          <w:szCs w:val="26"/>
-        </w:rPr>
-      </w:pPr>
-      <w:r>
-        <w:rPr>
-          <w:rFonts w:ascii="Arial" w:hAnsi="Arial" w:cs="Arial"/>
-          <w:sz w:val="26"/>
-          <w:szCs w:val="26"/>
+          <w:color w:val="000000" w:themeColor="text1"/>
+          <w:sz w:val="24"/>
+          <w:szCs w:val="24"/>
+        </w:rPr>
+      </w:pPr>
+      <w:r>
+        <w:rPr>
+          <w:rFonts w:ascii="Arial" w:hAnsi="Arial" w:cs="Arial"/>
+          <w:color w:val="000000" w:themeColor="text1"/>
+          <w:sz w:val="24"/>
+          <w:szCs w:val="24"/>
         </w:rPr>
         <w:t xml:space="preserve">For this module I decided to </w:t>
       </w:r>
       <w:r>
         <w:rPr>
           <w:rFonts w:ascii="Arial" w:hAnsi="Arial" w:cs="Arial"/>
-          <w:sz w:val="26"/>
-          <w:szCs w:val="26"/>
+          <w:color w:val="000000" w:themeColor="text1"/>
+          <w:sz w:val="24"/>
+          <w:szCs w:val="24"/>
         </w:rPr>
         <w:t>focus the features I added around</w:t>
       </w:r>
       <w:r>
         <w:rPr>
           <w:rFonts w:ascii="Arial" w:hAnsi="Arial" w:cs="Arial"/>
-          <w:sz w:val="26"/>
-          <w:szCs w:val="26"/>
+          <w:color w:val="000000" w:themeColor="text1"/>
+          <w:sz w:val="24"/>
+          <w:szCs w:val="24"/>
         </w:rPr>
         <w:t xml:space="preserve"> the objects present in the scene.</w:t>
       </w:r>
       <w:r>
         <w:rPr>
           <w:rFonts w:ascii="Arial" w:hAnsi="Arial" w:cs="Arial"/>
-          <w:sz w:val="26"/>
-          <w:szCs w:val="26"/>
+          <w:color w:val="000000" w:themeColor="text1"/>
+          <w:sz w:val="24"/>
+          <w:szCs w:val="24"/>
         </w:rPr>
         <w:t xml:space="preserve"> </w:t>
       </w:r>
       <w:r>
         <w:rPr>
           <w:rFonts w:ascii="Arial" w:hAnsi="Arial" w:cs="Arial"/>
-          <w:sz w:val="26"/>
-          <w:szCs w:val="26"/>
+          <w:color w:val="000000" w:themeColor="text1"/>
+          <w:sz w:val="24"/>
+          <w:szCs w:val="24"/>
         </w:rPr>
         <w:t>The first feature added that was not covered in the labs was the ability to copy and paste objects. By pressing Ctrl + C, the object currently selected will be set as the copied object. Pressing Ctrl + V will create a copy of the copied object just above the original.</w:t>
       </w:r>
       <w:r>
         <w:rPr>
           <w:rFonts w:ascii="Arial" w:hAnsi="Arial" w:cs="Arial"/>
-          <w:sz w:val="26"/>
-          <w:szCs w:val="26"/>
+          <w:color w:val="000000" w:themeColor="text1"/>
+          <w:sz w:val="24"/>
+          <w:szCs w:val="24"/>
         </w:rPr>
         <w:t xml:space="preserve"> Deleting objects was the next feature I added</w:t>
       </w:r>
       <w:r>
         <w:rPr>
           <w:rFonts w:ascii="Arial" w:hAnsi="Arial" w:cs="Arial"/>
-          <w:sz w:val="26"/>
-          <w:szCs w:val="26"/>
+          <w:color w:val="000000" w:themeColor="text1"/>
+          <w:sz w:val="24"/>
+          <w:szCs w:val="24"/>
         </w:rPr>
         <w:t>. Pressing backspace while selecting an object will delete it from the scene.</w:t>
       </w:r>
       <w:r>
         <w:rPr>
           <w:rFonts w:ascii="Arial" w:hAnsi="Arial" w:cs="Arial"/>
-          <w:sz w:val="26"/>
-          <w:szCs w:val="26"/>
+          <w:color w:val="000000" w:themeColor="text1"/>
+          <w:sz w:val="24"/>
+          <w:szCs w:val="24"/>
         </w:rPr>
         <w:t xml:space="preserve"> After that, undoing and redoing were added, however they went through some changes. The final version sees the user pressing Ctrl + Z to undo an action they have previously done.</w:t>
       </w:r>
       <w:r>
         <w:rPr>
           <w:rFonts w:ascii="Arial" w:hAnsi="Arial" w:cs="Arial"/>
-          <w:sz w:val="26"/>
-          <w:szCs w:val="26"/>
+          <w:color w:val="000000" w:themeColor="text1"/>
+          <w:sz w:val="24"/>
+          <w:szCs w:val="24"/>
         </w:rPr>
         <w:t xml:space="preserve"> They can press this multiple times to continue undoing their changes. </w:t>
       </w:r>
       <w:r>
         <w:rPr>
           <w:rFonts w:ascii="Arial" w:hAnsi="Arial" w:cs="Arial"/>
-          <w:sz w:val="26"/>
-          <w:szCs w:val="26"/>
+          <w:color w:val="000000" w:themeColor="text1"/>
+          <w:sz w:val="24"/>
+          <w:szCs w:val="24"/>
         </w:rPr>
         <w:t xml:space="preserve">Pressing Ctrl + Y will redo the last undo action they did, in case the user undid too much. </w:t>
       </w:r>
       <w:r>
         <w:rPr>
           <w:rFonts w:ascii="Arial" w:hAnsi="Arial" w:cs="Arial"/>
-          <w:sz w:val="26"/>
-          <w:szCs w:val="26"/>
+          <w:color w:val="000000" w:themeColor="text1"/>
+          <w:sz w:val="24"/>
+          <w:szCs w:val="24"/>
         </w:rPr>
         <w:t>The final feature added was the object editor. Selecting an object then opening the editor menu will show the user a menu with the current objects position, rotation and scale. The user can alter these values if the wish and upon pressing the OK button, will edit the object with the new attributes.</w:t>
       </w:r>
@@ -229,8 +250,9 @@
         <w:spacing w:line="276" w:lineRule="auto"/>
         <w:rPr>
           <w:rFonts w:ascii="Arial" w:hAnsi="Arial" w:cs="Arial"/>
-          <w:sz w:val="26"/>
-          <w:szCs w:val="26"/>
+          <w:color w:val="000000" w:themeColor="text1"/>
+          <w:sz w:val="24"/>
+          <w:szCs w:val="24"/>
         </w:rPr>
       </w:pPr>
     </w:p>
@@ -243,8 +265,8 @@
           <w:b/>
           <w:bCs/>
           <w:color w:val="000000" w:themeColor="text1"/>
-          <w:sz w:val="26"/>
-          <w:szCs w:val="26"/>
+          <w:sz w:val="28"/>
+          <w:szCs w:val="28"/>
         </w:rPr>
       </w:pPr>
       <w:r>
@@ -253,8 +275,8 @@
           <w:b/>
           <w:bCs/>
           <w:color w:val="000000" w:themeColor="text1"/>
-          <w:sz w:val="26"/>
-          <w:szCs w:val="26"/>
+          <w:sz w:val="28"/>
+          <w:szCs w:val="28"/>
         </w:rPr>
         <w:t>Controls:</w:t>
       </w:r>
@@ -263,14 +285,16 @@
       <w:pPr>
         <w:spacing w:line="276" w:lineRule="auto"/>
         <w:rPr>
-          <w:sz w:val="26"/>
-          <w:szCs w:val="26"/>
-        </w:rPr>
-      </w:pPr>
-      <w:r>
-        <w:rPr>
-          <w:sz w:val="26"/>
-          <w:szCs w:val="26"/>
+          <w:color w:val="000000" w:themeColor="text1"/>
+          <w:sz w:val="24"/>
+          <w:szCs w:val="24"/>
+        </w:rPr>
+      </w:pPr>
+      <w:r>
+        <w:rPr>
+          <w:color w:val="000000" w:themeColor="text1"/>
+          <w:sz w:val="24"/>
+          <w:szCs w:val="24"/>
         </w:rPr>
         <w:t>Camera Horizontal Movement: WASD</w:t>
       </w:r>
@@ -279,14 +303,16 @@
       <w:pPr>
         <w:spacing w:line="276" w:lineRule="auto"/>
         <w:rPr>
-          <w:sz w:val="26"/>
-          <w:szCs w:val="26"/>
-        </w:rPr>
-      </w:pPr>
-      <w:r>
-        <w:rPr>
-          <w:sz w:val="26"/>
-          <w:szCs w:val="26"/>
+          <w:color w:val="000000" w:themeColor="text1"/>
+          <w:sz w:val="24"/>
+          <w:szCs w:val="24"/>
+        </w:rPr>
+      </w:pPr>
+      <w:r>
+        <w:rPr>
+          <w:color w:val="000000" w:themeColor="text1"/>
+          <w:sz w:val="24"/>
+          <w:szCs w:val="24"/>
         </w:rPr>
         <w:t>Camera Vertical Movement: Space = Up, Shift + Space = Down</w:t>
       </w:r>
@@ -295,14 +321,16 @@
       <w:pPr>
         <w:spacing w:line="276" w:lineRule="auto"/>
         <w:rPr>
-          <w:sz w:val="26"/>
-          <w:szCs w:val="26"/>
-        </w:rPr>
-      </w:pPr>
-      <w:r>
-        <w:rPr>
-          <w:sz w:val="26"/>
-          <w:szCs w:val="26"/>
+          <w:color w:val="000000" w:themeColor="text1"/>
+          <w:sz w:val="24"/>
+          <w:szCs w:val="24"/>
+        </w:rPr>
+      </w:pPr>
+      <w:r>
+        <w:rPr>
+          <w:color w:val="000000" w:themeColor="text1"/>
+          <w:sz w:val="24"/>
+          <w:szCs w:val="24"/>
         </w:rPr>
         <w:t>Camera Look: Mouse Move</w:t>
       </w:r>
@@ -311,14 +339,16 @@
       <w:pPr>
         <w:spacing w:line="276" w:lineRule="auto"/>
         <w:rPr>
-          <w:sz w:val="26"/>
-          <w:szCs w:val="26"/>
-        </w:rPr>
-      </w:pPr>
-      <w:r>
-        <w:rPr>
-          <w:sz w:val="26"/>
-          <w:szCs w:val="26"/>
+          <w:color w:val="000000" w:themeColor="text1"/>
+          <w:sz w:val="24"/>
+          <w:szCs w:val="24"/>
+        </w:rPr>
+      </w:pPr>
+      <w:r>
+        <w:rPr>
+          <w:color w:val="000000" w:themeColor="text1"/>
+          <w:sz w:val="24"/>
+          <w:szCs w:val="24"/>
         </w:rPr>
         <w:t>Camera Turn: Q = Left, E = Right</w:t>
       </w:r>
@@ -327,21 +357,24 @@
       <w:pPr>
         <w:spacing w:line="276" w:lineRule="auto"/>
         <w:rPr>
-          <w:sz w:val="26"/>
-          <w:szCs w:val="26"/>
-        </w:rPr>
-      </w:pPr>
-      <w:r>
-        <w:rPr>
-          <w:sz w:val="26"/>
-          <w:szCs w:val="26"/>
+          <w:color w:val="000000" w:themeColor="text1"/>
+          <w:sz w:val="24"/>
+          <w:szCs w:val="24"/>
+        </w:rPr>
+      </w:pPr>
+      <w:r>
+        <w:rPr>
+          <w:color w:val="000000" w:themeColor="text1"/>
+          <w:sz w:val="24"/>
+          <w:szCs w:val="24"/>
         </w:rPr>
         <w:t xml:space="preserve">Select Object: </w:t>
       </w:r>
       <w:r>
         <w:rPr>
-          <w:sz w:val="26"/>
-          <w:szCs w:val="26"/>
+          <w:color w:val="000000" w:themeColor="text1"/>
+          <w:sz w:val="24"/>
+          <w:szCs w:val="24"/>
         </w:rPr>
         <w:t>LMB (Selected ID show in bottom right)</w:t>
       </w:r>
@@ -350,14 +383,16 @@
       <w:pPr>
         <w:spacing w:line="276" w:lineRule="auto"/>
         <w:rPr>
-          <w:sz w:val="26"/>
-          <w:szCs w:val="26"/>
-        </w:rPr>
-      </w:pPr>
-      <w:r>
-        <w:rPr>
-          <w:sz w:val="26"/>
-          <w:szCs w:val="26"/>
+          <w:color w:val="000000" w:themeColor="text1"/>
+          <w:sz w:val="24"/>
+          <w:szCs w:val="24"/>
+        </w:rPr>
+      </w:pPr>
+      <w:r>
+        <w:rPr>
+          <w:color w:val="000000" w:themeColor="text1"/>
+          <w:sz w:val="24"/>
+          <w:szCs w:val="24"/>
         </w:rPr>
         <w:t>Open Object Editor: Edit -&gt; Edit Object</w:t>
       </w:r>
@@ -366,14 +401,16 @@
       <w:pPr>
         <w:spacing w:line="276" w:lineRule="auto"/>
         <w:rPr>
-          <w:sz w:val="26"/>
-          <w:szCs w:val="26"/>
-        </w:rPr>
-      </w:pPr>
-      <w:r>
-        <w:rPr>
-          <w:sz w:val="26"/>
-          <w:szCs w:val="26"/>
+          <w:color w:val="000000" w:themeColor="text1"/>
+          <w:sz w:val="24"/>
+          <w:szCs w:val="24"/>
+        </w:rPr>
+      </w:pPr>
+      <w:r>
+        <w:rPr>
+          <w:color w:val="000000" w:themeColor="text1"/>
+          <w:sz w:val="24"/>
+          <w:szCs w:val="24"/>
         </w:rPr>
         <w:t xml:space="preserve">Copy Selected Object: Ctrl + C </w:t>
       </w:r>
@@ -382,14 +419,16 @@
       <w:pPr>
         <w:spacing w:line="276" w:lineRule="auto"/>
         <w:rPr>
-          <w:sz w:val="26"/>
-          <w:szCs w:val="26"/>
-        </w:rPr>
-      </w:pPr>
-      <w:r>
-        <w:rPr>
-          <w:sz w:val="26"/>
-          <w:szCs w:val="26"/>
+          <w:color w:val="000000" w:themeColor="text1"/>
+          <w:sz w:val="24"/>
+          <w:szCs w:val="24"/>
+        </w:rPr>
+      </w:pPr>
+      <w:r>
+        <w:rPr>
+          <w:color w:val="000000" w:themeColor="text1"/>
+          <w:sz w:val="24"/>
+          <w:szCs w:val="24"/>
         </w:rPr>
         <w:t>Paste Copied Object: Ctrl + V</w:t>
       </w:r>
@@ -398,33 +437,56 @@
       <w:pPr>
         <w:spacing w:line="276" w:lineRule="auto"/>
         <w:rPr>
-          <w:sz w:val="26"/>
-          <w:szCs w:val="26"/>
-        </w:rPr>
-      </w:pPr>
-      <w:r>
-        <w:rPr>
-          <w:sz w:val="26"/>
-          <w:szCs w:val="26"/>
+          <w:color w:val="000000" w:themeColor="text1"/>
+          <w:sz w:val="24"/>
+          <w:szCs w:val="24"/>
+        </w:rPr>
+      </w:pPr>
+      <w:r>
+        <w:rPr>
+          <w:color w:val="000000" w:themeColor="text1"/>
+          <w:sz w:val="24"/>
+          <w:szCs w:val="24"/>
+        </w:rPr>
+        <w:t>Delete Selected Object: Backspace</w:t>
+      </w:r>
+    </w:p>
+    <w:p>
+      <w:pPr>
+        <w:spacing w:line="276" w:lineRule="auto"/>
+        <w:rPr>
+          <w:color w:val="000000" w:themeColor="text1"/>
+          <w:sz w:val="24"/>
+          <w:szCs w:val="24"/>
+        </w:rPr>
+      </w:pPr>
+      <w:r>
+        <w:rPr>
+          <w:color w:val="000000" w:themeColor="text1"/>
+          <w:sz w:val="24"/>
+          <w:szCs w:val="24"/>
+        </w:rPr>
+        <w:t>Undo: Ctrl + Z</w:t>
+      </w:r>
+    </w:p>
+    <w:p>
+      <w:pPr>
+        <w:spacing w:line="276" w:lineRule="auto"/>
+        <w:ind w:left="720" w:hanging="720"/>
+        <w:rPr>
+          <w:color w:val="000000" w:themeColor="text1"/>
+          <w:sz w:val="24"/>
+          <w:szCs w:val="24"/>
+        </w:rPr>
+      </w:pPr>
+      <w:r>
+        <w:rPr>
+          <w:color w:val="000000" w:themeColor="text1"/>
+          <w:sz w:val="24"/>
+          <w:szCs w:val="24"/>
         </w:rPr>
         <w:lastRenderedPageBreak/>
-        <w:t>Delete Selected Object: Backspace</w:t>
-      </w:r>
-    </w:p>
-    <w:p>
-      <w:pPr>
-        <w:spacing w:line="276" w:lineRule="auto"/>
-        <w:rPr>
-          <w:sz w:val="26"/>
-          <w:szCs w:val="26"/>
-        </w:rPr>
-      </w:pPr>
-      <w:r>
-        <w:rPr>
-          <w:sz w:val="26"/>
-          <w:szCs w:val="26"/>
-        </w:rPr>
-        <w:t>Undo: Ctrl + Z</w:t>
+        <w:t>Redo: Ctrl + Y</w:t>
       </w:r>
     </w:p>
     <w:p>
@@ -432,25 +494,9 @@
         <w:spacing w:line="276" w:lineRule="auto"/>
         <w:ind w:left="720" w:hanging="720"/>
         <w:rPr>
-          <w:sz w:val="26"/>
-          <w:szCs w:val="26"/>
-        </w:rPr>
-      </w:pPr>
-      <w:r>
-        <w:rPr>
-          <w:sz w:val="26"/>
-          <w:szCs w:val="26"/>
-        </w:rPr>
-        <w:t>Redo: Ctrl + Y</w:t>
-      </w:r>
-    </w:p>
-    <w:p>
-      <w:pPr>
-        <w:spacing w:line="276" w:lineRule="auto"/>
-        <w:ind w:left="720" w:hanging="720"/>
-        <w:rPr>
-          <w:sz w:val="26"/>
-          <w:szCs w:val="26"/>
+          <w:color w:val="000000" w:themeColor="text1"/>
+          <w:sz w:val="24"/>
+          <w:szCs w:val="24"/>
         </w:rPr>
       </w:pPr>
     </w:p>
@@ -463,8 +509,8 @@
           <w:b/>
           <w:bCs/>
           <w:color w:val="000000" w:themeColor="text1"/>
-          <w:sz w:val="26"/>
-          <w:szCs w:val="26"/>
+          <w:sz w:val="28"/>
+          <w:szCs w:val="28"/>
         </w:rPr>
       </w:pPr>
       <w:r>
@@ -473,8 +519,8 @@
           <w:b/>
           <w:bCs/>
           <w:color w:val="000000" w:themeColor="text1"/>
-          <w:sz w:val="26"/>
-          <w:szCs w:val="26"/>
+          <w:sz w:val="28"/>
+          <w:szCs w:val="28"/>
         </w:rPr>
         <w:t>Copy / Paste:</w:t>
       </w:r>
@@ -483,126 +529,316 @@
       <w:pPr>
         <w:spacing w:line="276" w:lineRule="auto"/>
         <w:rPr>
-          <w:sz w:val="26"/>
-          <w:szCs w:val="26"/>
-        </w:rPr>
-      </w:pPr>
-      <w:r>
-        <w:rPr>
-          <w:sz w:val="26"/>
-          <w:szCs w:val="26"/>
-        </w:rPr>
-        <w:t>The copy and paste function is a feature that most pieces of software are equipped with. This is because it is one of the most useful and important actions a user can take and can save an incredible amount of time.</w:t>
-      </w:r>
-      <w:r>
-        <w:rPr>
-          <w:sz w:val="26"/>
-          <w:szCs w:val="26"/>
-        </w:rPr>
-        <w:t xml:space="preserve"> The user must have first seleted an object by clicking on it. Then, the must press the control key and the letter C as this is the </w:t>
-      </w:r>
-      <w:r>
-        <w:rPr>
-          <w:sz w:val="26"/>
-          <w:szCs w:val="26"/>
+          <w:color w:val="000000" w:themeColor="text1"/>
+          <w:sz w:val="24"/>
+          <w:szCs w:val="24"/>
+        </w:rPr>
+      </w:pPr>
+      <w:r>
+        <w:rPr>
+          <w:color w:val="000000" w:themeColor="text1"/>
+          <w:sz w:val="24"/>
+          <w:szCs w:val="24"/>
+        </w:rPr>
+        <w:t xml:space="preserve">The copy and paste function </w:t>
+      </w:r>
+      <w:proofErr w:type="gramStart"/>
+      <w:r>
+        <w:rPr>
+          <w:color w:val="000000" w:themeColor="text1"/>
+          <w:sz w:val="24"/>
+          <w:szCs w:val="24"/>
+        </w:rPr>
+        <w:t>is</w:t>
+      </w:r>
+      <w:proofErr w:type="gramEnd"/>
+      <w:r>
+        <w:rPr>
+          <w:color w:val="000000" w:themeColor="text1"/>
+          <w:sz w:val="24"/>
+          <w:szCs w:val="24"/>
+        </w:rPr>
+        <w:t xml:space="preserve"> a feature that most pieces of software are equipped with. This is because it is one of the most useful and important actions a user can take and can save an incredible amount of time.</w:t>
+      </w:r>
+      <w:r>
+        <w:rPr>
+          <w:color w:val="000000" w:themeColor="text1"/>
+          <w:sz w:val="24"/>
+          <w:szCs w:val="24"/>
+        </w:rPr>
+        <w:t xml:space="preserve"> The user must have first </w:t>
+      </w:r>
+      <w:proofErr w:type="spellStart"/>
+      <w:r>
+        <w:rPr>
+          <w:color w:val="000000" w:themeColor="text1"/>
+          <w:sz w:val="24"/>
+          <w:szCs w:val="24"/>
+        </w:rPr>
+        <w:t>seleted</w:t>
+      </w:r>
+      <w:proofErr w:type="spellEnd"/>
+      <w:r>
+        <w:rPr>
+          <w:color w:val="000000" w:themeColor="text1"/>
+          <w:sz w:val="24"/>
+          <w:szCs w:val="24"/>
+        </w:rPr>
+        <w:t xml:space="preserve"> an object by clicking on it. Then, the must press the control key and the letter C as this is the </w:t>
+      </w:r>
+      <w:r>
+        <w:rPr>
+          <w:color w:val="000000" w:themeColor="text1"/>
+          <w:sz w:val="24"/>
+          <w:szCs w:val="24"/>
         </w:rPr>
         <w:t>standard shortcut for copying.</w:t>
       </w:r>
       <w:r>
         <w:rPr>
-          <w:sz w:val="26"/>
-          <w:szCs w:val="26"/>
-        </w:rPr>
-        <w:t xml:space="preserve"> Once this combination of keys are pressed, the Copy</w:t>
-      </w:r>
-      <w:r>
-        <w:rPr>
-          <w:sz w:val="26"/>
-          <w:szCs w:val="26"/>
+          <w:color w:val="000000" w:themeColor="text1"/>
+          <w:sz w:val="24"/>
+          <w:szCs w:val="24"/>
+        </w:rPr>
+        <w:t xml:space="preserve"> Once this combination of keys </w:t>
+      </w:r>
+      <w:proofErr w:type="gramStart"/>
+      <w:r>
+        <w:rPr>
+          <w:color w:val="000000" w:themeColor="text1"/>
+          <w:sz w:val="24"/>
+          <w:szCs w:val="24"/>
+        </w:rPr>
+        <w:t>are</w:t>
+      </w:r>
+      <w:proofErr w:type="gramEnd"/>
+      <w:r>
+        <w:rPr>
+          <w:color w:val="000000" w:themeColor="text1"/>
+          <w:sz w:val="24"/>
+          <w:szCs w:val="24"/>
+        </w:rPr>
+        <w:t xml:space="preserve"> pressed, the </w:t>
+      </w:r>
+      <w:proofErr w:type="spellStart"/>
+      <w:r>
+        <w:rPr>
+          <w:color w:val="000000" w:themeColor="text1"/>
+          <w:sz w:val="24"/>
+          <w:szCs w:val="24"/>
+        </w:rPr>
+        <w:t>Copy</w:t>
+      </w:r>
+      <w:r>
+        <w:rPr>
+          <w:color w:val="000000" w:themeColor="text1"/>
+          <w:sz w:val="24"/>
+          <w:szCs w:val="24"/>
         </w:rPr>
         <w:t>Object</w:t>
       </w:r>
-      <w:r>
-        <w:rPr>
-          <w:sz w:val="26"/>
-          <w:szCs w:val="26"/>
+      <w:proofErr w:type="spellEnd"/>
+      <w:r>
+        <w:rPr>
+          <w:color w:val="000000" w:themeColor="text1"/>
+          <w:sz w:val="24"/>
+          <w:szCs w:val="24"/>
         </w:rPr>
         <w:t xml:space="preserve"> function is called in the Game class.</w:t>
       </w:r>
       <w:r>
         <w:rPr>
-          <w:sz w:val="26"/>
-          <w:szCs w:val="26"/>
+          <w:color w:val="000000" w:themeColor="text1"/>
+          <w:sz w:val="24"/>
+          <w:szCs w:val="24"/>
         </w:rPr>
         <w:t xml:space="preserve"> This function first checks if the selected ID is valid, being between 0 and the size of the scene graph. If the ID is valid, a</w:t>
       </w:r>
       <w:r>
         <w:rPr>
-          <w:sz w:val="26"/>
-          <w:szCs w:val="26"/>
-        </w:rPr>
-        <w:t>n empty scene object called copiedObject is set to the current object.</w:t>
-      </w:r>
-      <w:r>
-        <w:rPr>
-          <w:sz w:val="26"/>
-          <w:szCs w:val="26"/>
-        </w:rPr>
-        <w:t xml:space="preserve"> A boolean value called hasCopiedAnObject is then set as true</w:t>
-      </w:r>
-      <w:r>
-        <w:rPr>
-          <w:sz w:val="26"/>
-          <w:szCs w:val="26"/>
-        </w:rPr>
-        <w:t>, this variable is initally false as declared in the constructor</w:t>
-      </w:r>
-      <w:r>
-        <w:rPr>
-          <w:sz w:val="26"/>
-          <w:szCs w:val="26"/>
-        </w:rPr>
-        <w:t>. Finally, a float value called pasteExtraSpace is set to its default value, that being 3.f. These three variables</w:t>
-      </w:r>
-      <w:r>
-        <w:rPr>
-          <w:sz w:val="26"/>
-          <w:szCs w:val="26"/>
+          <w:color w:val="000000" w:themeColor="text1"/>
+          <w:sz w:val="24"/>
+          <w:szCs w:val="24"/>
+        </w:rPr>
+        <w:t xml:space="preserve">n empty scene object called </w:t>
+      </w:r>
+      <w:proofErr w:type="spellStart"/>
+      <w:r>
+        <w:rPr>
+          <w:color w:val="000000" w:themeColor="text1"/>
+          <w:sz w:val="24"/>
+          <w:szCs w:val="24"/>
+        </w:rPr>
+        <w:t>copiedObject</w:t>
+      </w:r>
+      <w:proofErr w:type="spellEnd"/>
+      <w:r>
+        <w:rPr>
+          <w:color w:val="000000" w:themeColor="text1"/>
+          <w:sz w:val="24"/>
+          <w:szCs w:val="24"/>
+        </w:rPr>
+        <w:t xml:space="preserve"> is set to the current object.</w:t>
+      </w:r>
+      <w:r>
+        <w:rPr>
+          <w:color w:val="000000" w:themeColor="text1"/>
+          <w:sz w:val="24"/>
+          <w:szCs w:val="24"/>
+        </w:rPr>
+        <w:t xml:space="preserve"> A </w:t>
+      </w:r>
+      <w:proofErr w:type="spellStart"/>
+      <w:r>
+        <w:rPr>
+          <w:color w:val="000000" w:themeColor="text1"/>
+          <w:sz w:val="24"/>
+          <w:szCs w:val="24"/>
+        </w:rPr>
+        <w:t>boolean</w:t>
+      </w:r>
+      <w:proofErr w:type="spellEnd"/>
+      <w:r>
+        <w:rPr>
+          <w:color w:val="000000" w:themeColor="text1"/>
+          <w:sz w:val="24"/>
+          <w:szCs w:val="24"/>
+        </w:rPr>
+        <w:t xml:space="preserve"> value called </w:t>
+      </w:r>
+      <w:proofErr w:type="spellStart"/>
+      <w:r>
+        <w:rPr>
+          <w:color w:val="000000" w:themeColor="text1"/>
+          <w:sz w:val="24"/>
+          <w:szCs w:val="24"/>
+        </w:rPr>
+        <w:t>hasCopiedAnObject</w:t>
+      </w:r>
+      <w:proofErr w:type="spellEnd"/>
+      <w:r>
+        <w:rPr>
+          <w:color w:val="000000" w:themeColor="text1"/>
+          <w:sz w:val="24"/>
+          <w:szCs w:val="24"/>
+        </w:rPr>
+        <w:t xml:space="preserve"> is then set as true</w:t>
+      </w:r>
+      <w:r>
+        <w:rPr>
+          <w:color w:val="000000" w:themeColor="text1"/>
+          <w:sz w:val="24"/>
+          <w:szCs w:val="24"/>
+        </w:rPr>
+        <w:t xml:space="preserve">, this variable is </w:t>
+      </w:r>
+      <w:proofErr w:type="spellStart"/>
+      <w:r>
+        <w:rPr>
+          <w:color w:val="000000" w:themeColor="text1"/>
+          <w:sz w:val="24"/>
+          <w:szCs w:val="24"/>
+        </w:rPr>
+        <w:t>initally</w:t>
+      </w:r>
+      <w:proofErr w:type="spellEnd"/>
+      <w:r>
+        <w:rPr>
+          <w:color w:val="000000" w:themeColor="text1"/>
+          <w:sz w:val="24"/>
+          <w:szCs w:val="24"/>
+        </w:rPr>
+        <w:t xml:space="preserve"> false as declared in the constructor</w:t>
+      </w:r>
+      <w:r>
+        <w:rPr>
+          <w:color w:val="000000" w:themeColor="text1"/>
+          <w:sz w:val="24"/>
+          <w:szCs w:val="24"/>
+        </w:rPr>
+        <w:t xml:space="preserve">. Finally, a float value called </w:t>
+      </w:r>
+      <w:proofErr w:type="spellStart"/>
+      <w:r>
+        <w:rPr>
+          <w:color w:val="000000" w:themeColor="text1"/>
+          <w:sz w:val="24"/>
+          <w:szCs w:val="24"/>
+        </w:rPr>
+        <w:t>pasteExtraSpace</w:t>
+      </w:r>
+      <w:proofErr w:type="spellEnd"/>
+      <w:r>
+        <w:rPr>
+          <w:color w:val="000000" w:themeColor="text1"/>
+          <w:sz w:val="24"/>
+          <w:szCs w:val="24"/>
+        </w:rPr>
+        <w:t xml:space="preserve"> is set to its default value, that being 3.f. These three variables</w:t>
+      </w:r>
+      <w:r>
+        <w:rPr>
+          <w:color w:val="000000" w:themeColor="text1"/>
+          <w:sz w:val="24"/>
+          <w:szCs w:val="24"/>
         </w:rPr>
         <w:t xml:space="preserve"> are all used later for the pasting functionality</w:t>
       </w:r>
       <w:r>
         <w:rPr>
-          <w:sz w:val="26"/>
-          <w:szCs w:val="26"/>
+          <w:color w:val="000000" w:themeColor="text1"/>
+          <w:sz w:val="24"/>
+          <w:szCs w:val="24"/>
         </w:rPr>
         <w:t xml:space="preserve">. Once an object is copied, it cannot be uncopied until another object has been copied, overwriting </w:t>
       </w:r>
       <w:r>
         <w:rPr>
-          <w:sz w:val="26"/>
-          <w:szCs w:val="26"/>
+          <w:color w:val="000000" w:themeColor="text1"/>
+          <w:sz w:val="24"/>
+          <w:szCs w:val="24"/>
         </w:rPr>
         <w:t>it.</w:t>
       </w:r>
       <w:r>
         <w:rPr>
-          <w:sz w:val="26"/>
-          <w:szCs w:val="26"/>
-        </w:rPr>
-        <w:t xml:space="preserve"> At first, this seems like a downside, but uncopying an object is not a feature that really needs to be present, shown by other industry software</w:t>
-      </w:r>
-      <w:r>
-        <w:rPr>
-          <w:sz w:val="26"/>
-          <w:szCs w:val="26"/>
+          <w:color w:val="000000" w:themeColor="text1"/>
+          <w:sz w:val="24"/>
+          <w:szCs w:val="24"/>
+        </w:rPr>
+        <w:t xml:space="preserve"> At first, this seems like a downside, but </w:t>
+      </w:r>
+      <w:proofErr w:type="spellStart"/>
+      <w:r>
+        <w:rPr>
+          <w:color w:val="000000" w:themeColor="text1"/>
+          <w:sz w:val="24"/>
+          <w:szCs w:val="24"/>
+        </w:rPr>
+        <w:t>uncopying</w:t>
+      </w:r>
+      <w:proofErr w:type="spellEnd"/>
+      <w:r>
+        <w:rPr>
+          <w:color w:val="000000" w:themeColor="text1"/>
+          <w:sz w:val="24"/>
+          <w:szCs w:val="24"/>
+        </w:rPr>
+        <w:t xml:space="preserve"> an object is not a feature that really needs to be present, shown by other industry software</w:t>
+      </w:r>
+      <w:r>
+        <w:rPr>
+          <w:color w:val="000000" w:themeColor="text1"/>
+          <w:sz w:val="24"/>
+          <w:szCs w:val="24"/>
         </w:rPr>
         <w:t xml:space="preserve"> (such as Unreal Engine)</w:t>
       </w:r>
       <w:r>
         <w:rPr>
-          <w:sz w:val="26"/>
-          <w:szCs w:val="26"/>
+          <w:color w:val="000000" w:themeColor="text1"/>
+          <w:sz w:val="24"/>
+          <w:szCs w:val="24"/>
         </w:rPr>
         <w:t xml:space="preserve"> also lacking this feature.</w:t>
       </w:r>
@@ -611,291 +847,712 @@
       <w:pPr>
         <w:spacing w:line="276" w:lineRule="auto"/>
         <w:rPr>
-          <w:sz w:val="26"/>
-          <w:szCs w:val="26"/>
-        </w:rPr>
-      </w:pPr>
-      <w:r>
-        <w:rPr>
-          <w:sz w:val="26"/>
-          <w:szCs w:val="26"/>
+          <w:color w:val="000000" w:themeColor="text1"/>
+          <w:sz w:val="24"/>
+          <w:szCs w:val="24"/>
+        </w:rPr>
+      </w:pPr>
+      <w:r>
+        <w:rPr>
+          <w:color w:val="000000" w:themeColor="text1"/>
+          <w:sz w:val="24"/>
+          <w:szCs w:val="24"/>
         </w:rPr>
         <w:t>The second part of this function is the ability to paste copied objects.</w:t>
       </w:r>
       <w:r>
         <w:rPr>
-          <w:sz w:val="26"/>
-          <w:szCs w:val="26"/>
-        </w:rPr>
-        <w:t xml:space="preserve"> When control and V are pressed together, the PasteObject function in the Game class is called, similar to the copy function</w:t>
-      </w:r>
-      <w:r>
-        <w:rPr>
-          <w:sz w:val="26"/>
-          <w:szCs w:val="26"/>
+          <w:color w:val="000000" w:themeColor="text1"/>
+          <w:sz w:val="24"/>
+          <w:szCs w:val="24"/>
+        </w:rPr>
+        <w:t xml:space="preserve"> When control and V are pressed together, the </w:t>
+      </w:r>
+      <w:proofErr w:type="spellStart"/>
+      <w:r>
+        <w:rPr>
+          <w:color w:val="000000" w:themeColor="text1"/>
+          <w:sz w:val="24"/>
+          <w:szCs w:val="24"/>
+        </w:rPr>
+        <w:t>PasteObject</w:t>
+      </w:r>
+      <w:proofErr w:type="spellEnd"/>
+      <w:r>
+        <w:rPr>
+          <w:color w:val="000000" w:themeColor="text1"/>
+          <w:sz w:val="24"/>
+          <w:szCs w:val="24"/>
+        </w:rPr>
+        <w:t xml:space="preserve"> function in the Game class is called, </w:t>
+      </w:r>
+      <w:proofErr w:type="gramStart"/>
+      <w:r>
+        <w:rPr>
+          <w:color w:val="000000" w:themeColor="text1"/>
+          <w:sz w:val="24"/>
+          <w:szCs w:val="24"/>
+        </w:rPr>
+        <w:t>similar to</w:t>
+      </w:r>
+      <w:proofErr w:type="gramEnd"/>
+      <w:r>
+        <w:rPr>
+          <w:color w:val="000000" w:themeColor="text1"/>
+          <w:sz w:val="24"/>
+          <w:szCs w:val="24"/>
+        </w:rPr>
+        <w:t xml:space="preserve"> the copy function</w:t>
+      </w:r>
+      <w:r>
+        <w:rPr>
+          <w:color w:val="000000" w:themeColor="text1"/>
+          <w:sz w:val="24"/>
+          <w:szCs w:val="24"/>
         </w:rPr>
         <w:t xml:space="preserve">. In this function, the first </w:t>
       </w:r>
       <w:r>
         <w:rPr>
-          <w:sz w:val="26"/>
-          <w:szCs w:val="26"/>
+          <w:color w:val="000000" w:themeColor="text1"/>
+          <w:sz w:val="24"/>
+          <w:szCs w:val="24"/>
         </w:rPr>
         <w:t>thing</w:t>
       </w:r>
       <w:r>
         <w:rPr>
-          <w:sz w:val="26"/>
-          <w:szCs w:val="26"/>
+          <w:color w:val="000000" w:themeColor="text1"/>
+          <w:sz w:val="24"/>
+          <w:szCs w:val="24"/>
         </w:rPr>
         <w:t xml:space="preserve"> that happens is a check to see if an object has indeed been copied.</w:t>
       </w:r>
       <w:r>
         <w:rPr>
-          <w:sz w:val="26"/>
-          <w:szCs w:val="26"/>
+          <w:color w:val="000000" w:themeColor="text1"/>
+          <w:sz w:val="24"/>
+          <w:szCs w:val="24"/>
         </w:rPr>
         <w:t xml:space="preserve"> This is the </w:t>
       </w:r>
-      <w:r>
-        <w:rPr>
-          <w:sz w:val="26"/>
-          <w:szCs w:val="26"/>
+      <w:proofErr w:type="spellStart"/>
+      <w:r>
+        <w:rPr>
+          <w:color w:val="000000" w:themeColor="text1"/>
+          <w:sz w:val="24"/>
+          <w:szCs w:val="24"/>
         </w:rPr>
         <w:t>hasCopiedAnObject</w:t>
       </w:r>
-      <w:r>
-        <w:rPr>
-          <w:sz w:val="26"/>
-          <w:szCs w:val="26"/>
-        </w:rPr>
-        <w:t xml:space="preserve"> boolean that was set to true in copyObject</w:t>
-      </w:r>
-      <w:r>
-        <w:rPr>
-          <w:sz w:val="26"/>
-          <w:szCs w:val="26"/>
+      <w:proofErr w:type="spellEnd"/>
+      <w:r>
+        <w:rPr>
+          <w:color w:val="000000" w:themeColor="text1"/>
+          <w:sz w:val="24"/>
+          <w:szCs w:val="24"/>
+        </w:rPr>
+        <w:t xml:space="preserve"> </w:t>
+      </w:r>
+      <w:proofErr w:type="spellStart"/>
+      <w:r>
+        <w:rPr>
+          <w:color w:val="000000" w:themeColor="text1"/>
+          <w:sz w:val="24"/>
+          <w:szCs w:val="24"/>
+        </w:rPr>
+        <w:t>boolean</w:t>
+      </w:r>
+      <w:proofErr w:type="spellEnd"/>
+      <w:r>
+        <w:rPr>
+          <w:color w:val="000000" w:themeColor="text1"/>
+          <w:sz w:val="24"/>
+          <w:szCs w:val="24"/>
+        </w:rPr>
+        <w:t xml:space="preserve"> that was set to true in </w:t>
+      </w:r>
+      <w:proofErr w:type="spellStart"/>
+      <w:r>
+        <w:rPr>
+          <w:color w:val="000000" w:themeColor="text1"/>
+          <w:sz w:val="24"/>
+          <w:szCs w:val="24"/>
+        </w:rPr>
+        <w:t>copyObject</w:t>
+      </w:r>
+      <w:proofErr w:type="spellEnd"/>
+      <w:r>
+        <w:rPr>
+          <w:color w:val="000000" w:themeColor="text1"/>
+          <w:sz w:val="24"/>
+          <w:szCs w:val="24"/>
         </w:rPr>
         <w:t xml:space="preserve">, to make sure </w:t>
       </w:r>
       <w:r>
         <w:rPr>
-          <w:sz w:val="26"/>
-          <w:szCs w:val="26"/>
+          <w:color w:val="000000" w:themeColor="text1"/>
+          <w:sz w:val="24"/>
+          <w:szCs w:val="24"/>
         </w:rPr>
         <w:t>a crash doesn’t happen from a null object being pasted.</w:t>
       </w:r>
       <w:r>
         <w:rPr>
-          <w:sz w:val="26"/>
-          <w:szCs w:val="26"/>
-        </w:rPr>
-        <w:t xml:space="preserve"> Inside the if statement, addUndo is called from toolMain. This is because pasting an object is something that is undoable</w:t>
-      </w:r>
-      <w:r>
-        <w:rPr>
-          <w:sz w:val="26"/>
-          <w:szCs w:val="26"/>
-        </w:rPr>
-        <w:t>, however the addUndo function will be discussed more in the Undo / Redo section.</w:t>
-      </w:r>
-      <w:r>
-        <w:rPr>
-          <w:sz w:val="26"/>
-          <w:szCs w:val="26"/>
+          <w:color w:val="000000" w:themeColor="text1"/>
+          <w:sz w:val="24"/>
+          <w:szCs w:val="24"/>
+        </w:rPr>
+        <w:t xml:space="preserve"> Inside the if statement, </w:t>
+      </w:r>
+      <w:proofErr w:type="spellStart"/>
+      <w:r>
+        <w:rPr>
+          <w:color w:val="000000" w:themeColor="text1"/>
+          <w:sz w:val="24"/>
+          <w:szCs w:val="24"/>
+        </w:rPr>
+        <w:t>addUndo</w:t>
+      </w:r>
+      <w:proofErr w:type="spellEnd"/>
+      <w:r>
+        <w:rPr>
+          <w:color w:val="000000" w:themeColor="text1"/>
+          <w:sz w:val="24"/>
+          <w:szCs w:val="24"/>
+        </w:rPr>
+        <w:t xml:space="preserve"> is called from </w:t>
+      </w:r>
+      <w:proofErr w:type="spellStart"/>
+      <w:r>
+        <w:rPr>
+          <w:color w:val="000000" w:themeColor="text1"/>
+          <w:sz w:val="24"/>
+          <w:szCs w:val="24"/>
+        </w:rPr>
+        <w:t>toolMain</w:t>
+      </w:r>
+      <w:proofErr w:type="spellEnd"/>
+      <w:r>
+        <w:rPr>
+          <w:color w:val="000000" w:themeColor="text1"/>
+          <w:sz w:val="24"/>
+          <w:szCs w:val="24"/>
+        </w:rPr>
+        <w:t>. This is because pasting an object is something that is undoable</w:t>
+      </w:r>
+      <w:r>
+        <w:rPr>
+          <w:color w:val="000000" w:themeColor="text1"/>
+          <w:sz w:val="24"/>
+          <w:szCs w:val="24"/>
+        </w:rPr>
+        <w:t xml:space="preserve">, however the </w:t>
+      </w:r>
+      <w:proofErr w:type="spellStart"/>
+      <w:r>
+        <w:rPr>
+          <w:color w:val="000000" w:themeColor="text1"/>
+          <w:sz w:val="24"/>
+          <w:szCs w:val="24"/>
+        </w:rPr>
+        <w:t>addUndo</w:t>
+      </w:r>
+      <w:proofErr w:type="spellEnd"/>
+      <w:r>
+        <w:rPr>
+          <w:color w:val="000000" w:themeColor="text1"/>
+          <w:sz w:val="24"/>
+          <w:szCs w:val="24"/>
+        </w:rPr>
+        <w:t xml:space="preserve"> function will be discussed more in the Undo / Redo section.</w:t>
+      </w:r>
+      <w:r>
+        <w:rPr>
+          <w:color w:val="000000" w:themeColor="text1"/>
+          <w:sz w:val="24"/>
+          <w:szCs w:val="24"/>
         </w:rPr>
         <w:t xml:space="preserve"> Next, a new object is created in the scene.</w:t>
       </w:r>
       <w:r>
         <w:rPr>
-          <w:sz w:val="26"/>
-          <w:szCs w:val="26"/>
-        </w:rPr>
-        <w:t xml:space="preserve"> A SceneObject called newObject is set as copiedObject, this means all of it’s attributes are </w:t>
-      </w:r>
-      <w:r>
-        <w:rPr>
-          <w:sz w:val="26"/>
-          <w:szCs w:val="26"/>
+          <w:color w:val="000000" w:themeColor="text1"/>
+          <w:sz w:val="24"/>
+          <w:szCs w:val="24"/>
+        </w:rPr>
+        <w:t xml:space="preserve"> A </w:t>
+      </w:r>
+      <w:proofErr w:type="spellStart"/>
+      <w:r>
+        <w:rPr>
+          <w:color w:val="000000" w:themeColor="text1"/>
+          <w:sz w:val="24"/>
+          <w:szCs w:val="24"/>
+        </w:rPr>
+        <w:t>SceneObject</w:t>
+      </w:r>
+      <w:proofErr w:type="spellEnd"/>
+      <w:r>
+        <w:rPr>
+          <w:color w:val="000000" w:themeColor="text1"/>
+          <w:sz w:val="24"/>
+          <w:szCs w:val="24"/>
+        </w:rPr>
+        <w:t xml:space="preserve"> called </w:t>
+      </w:r>
+      <w:proofErr w:type="spellStart"/>
+      <w:r>
+        <w:rPr>
+          <w:color w:val="000000" w:themeColor="text1"/>
+          <w:sz w:val="24"/>
+          <w:szCs w:val="24"/>
+        </w:rPr>
+        <w:t>newObject</w:t>
+      </w:r>
+      <w:proofErr w:type="spellEnd"/>
+      <w:r>
+        <w:rPr>
+          <w:color w:val="000000" w:themeColor="text1"/>
+          <w:sz w:val="24"/>
+          <w:szCs w:val="24"/>
+        </w:rPr>
+        <w:t xml:space="preserve"> is set as </w:t>
+      </w:r>
+      <w:proofErr w:type="spellStart"/>
+      <w:r>
+        <w:rPr>
+          <w:color w:val="000000" w:themeColor="text1"/>
+          <w:sz w:val="24"/>
+          <w:szCs w:val="24"/>
+        </w:rPr>
+        <w:t>copiedObject</w:t>
+      </w:r>
+      <w:proofErr w:type="spellEnd"/>
+      <w:r>
+        <w:rPr>
+          <w:color w:val="000000" w:themeColor="text1"/>
+          <w:sz w:val="24"/>
+          <w:szCs w:val="24"/>
+        </w:rPr>
+        <w:t xml:space="preserve">, this means all of </w:t>
+      </w:r>
+      <w:proofErr w:type="spellStart"/>
+      <w:r>
+        <w:rPr>
+          <w:color w:val="000000" w:themeColor="text1"/>
+          <w:sz w:val="24"/>
+          <w:szCs w:val="24"/>
+        </w:rPr>
+        <w:t>it’s</w:t>
+      </w:r>
+      <w:proofErr w:type="spellEnd"/>
+      <w:r>
+        <w:rPr>
+          <w:color w:val="000000" w:themeColor="text1"/>
+          <w:sz w:val="24"/>
+          <w:szCs w:val="24"/>
+        </w:rPr>
+        <w:t xml:space="preserve"> attributes are </w:t>
+      </w:r>
+      <w:r>
+        <w:rPr>
+          <w:color w:val="000000" w:themeColor="text1"/>
+          <w:sz w:val="24"/>
+          <w:szCs w:val="24"/>
         </w:rPr>
         <w:t>identical</w:t>
       </w:r>
       <w:r>
         <w:rPr>
-          <w:sz w:val="26"/>
-          <w:szCs w:val="26"/>
+          <w:color w:val="000000" w:themeColor="text1"/>
+          <w:sz w:val="24"/>
+          <w:szCs w:val="24"/>
         </w:rPr>
         <w:t>.</w:t>
       </w:r>
       <w:r>
         <w:rPr>
-          <w:sz w:val="26"/>
-          <w:szCs w:val="26"/>
+          <w:color w:val="000000" w:themeColor="text1"/>
+          <w:sz w:val="24"/>
+          <w:szCs w:val="24"/>
         </w:rPr>
         <w:t xml:space="preserve"> </w:t>
       </w:r>
-      <w:r>
-        <w:rPr>
-          <w:sz w:val="26"/>
-          <w:szCs w:val="26"/>
-        </w:rPr>
-        <w:t>So the new object isn’t occupying the exact same space as the original object, newObject</w:t>
-      </w:r>
-      <w:r>
-        <w:rPr>
-          <w:sz w:val="26"/>
-          <w:szCs w:val="26"/>
-        </w:rPr>
-        <w:t xml:space="preserve">’s Y position (it’s vertical position) is increased by the variable </w:t>
-      </w:r>
-      <w:r>
-        <w:rPr>
-          <w:sz w:val="26"/>
-          <w:szCs w:val="26"/>
+      <w:proofErr w:type="gramStart"/>
+      <w:r>
+        <w:rPr>
+          <w:color w:val="000000" w:themeColor="text1"/>
+          <w:sz w:val="24"/>
+          <w:szCs w:val="24"/>
+        </w:rPr>
+        <w:t>So</w:t>
+      </w:r>
+      <w:proofErr w:type="gramEnd"/>
+      <w:r>
+        <w:rPr>
+          <w:color w:val="000000" w:themeColor="text1"/>
+          <w:sz w:val="24"/>
+          <w:szCs w:val="24"/>
+        </w:rPr>
+        <w:t xml:space="preserve"> the new object isn’t occupying the exact same space as the original object, </w:t>
+      </w:r>
+      <w:proofErr w:type="spellStart"/>
+      <w:r>
+        <w:rPr>
+          <w:color w:val="000000" w:themeColor="text1"/>
+          <w:sz w:val="24"/>
+          <w:szCs w:val="24"/>
+        </w:rPr>
+        <w:t>newObject</w:t>
+      </w:r>
+      <w:r>
+        <w:rPr>
+          <w:color w:val="000000" w:themeColor="text1"/>
+          <w:sz w:val="24"/>
+          <w:szCs w:val="24"/>
+        </w:rPr>
+        <w:t>’s</w:t>
+      </w:r>
+      <w:proofErr w:type="spellEnd"/>
+      <w:r>
+        <w:rPr>
+          <w:color w:val="000000" w:themeColor="text1"/>
+          <w:sz w:val="24"/>
+          <w:szCs w:val="24"/>
+        </w:rPr>
+        <w:t xml:space="preserve"> Y position (it’s vertical position) is increased by the variable </w:t>
+      </w:r>
+      <w:proofErr w:type="spellStart"/>
+      <w:r>
+        <w:rPr>
+          <w:color w:val="000000" w:themeColor="text1"/>
+          <w:sz w:val="24"/>
+          <w:szCs w:val="24"/>
         </w:rPr>
         <w:t>pasteExtraSpace</w:t>
       </w:r>
-      <w:r>
-        <w:rPr>
-          <w:sz w:val="26"/>
-          <w:szCs w:val="26"/>
+      <w:proofErr w:type="spellEnd"/>
+      <w:r>
+        <w:rPr>
+          <w:color w:val="000000" w:themeColor="text1"/>
+          <w:sz w:val="24"/>
+          <w:szCs w:val="24"/>
         </w:rPr>
         <w:t>.</w:t>
       </w:r>
       <w:r>
         <w:rPr>
-          <w:sz w:val="26"/>
-          <w:szCs w:val="26"/>
-        </w:rPr>
-        <w:t xml:space="preserve"> When a new object is copied this variable is set to </w:t>
-      </w:r>
-      <w:r>
-        <w:rPr>
-          <w:sz w:val="26"/>
-          <w:szCs w:val="26"/>
+          <w:color w:val="000000" w:themeColor="text1"/>
+          <w:sz w:val="24"/>
+          <w:szCs w:val="24"/>
+        </w:rPr>
+        <w:t xml:space="preserve"> When a new object is </w:t>
+      </w:r>
+      <w:proofErr w:type="gramStart"/>
+      <w:r>
+        <w:rPr>
+          <w:color w:val="000000" w:themeColor="text1"/>
+          <w:sz w:val="24"/>
+          <w:szCs w:val="24"/>
+        </w:rPr>
+        <w:t>copied</w:t>
+      </w:r>
+      <w:proofErr w:type="gramEnd"/>
+      <w:r>
+        <w:rPr>
+          <w:color w:val="000000" w:themeColor="text1"/>
+          <w:sz w:val="24"/>
+          <w:szCs w:val="24"/>
+        </w:rPr>
+        <w:t xml:space="preserve"> this variable is set to </w:t>
+      </w:r>
+      <w:proofErr w:type="spellStart"/>
+      <w:r>
+        <w:rPr>
+          <w:color w:val="000000" w:themeColor="text1"/>
+          <w:sz w:val="24"/>
+          <w:szCs w:val="24"/>
+        </w:rPr>
+        <w:t>pasteExtraSpaceBase</w:t>
+      </w:r>
+      <w:proofErr w:type="spellEnd"/>
+      <w:r>
+        <w:rPr>
+          <w:color w:val="000000" w:themeColor="text1"/>
+          <w:sz w:val="24"/>
+          <w:szCs w:val="24"/>
+        </w:rPr>
+        <w:t xml:space="preserve">, which is </w:t>
+      </w:r>
+      <w:proofErr w:type="spellStart"/>
+      <w:r>
+        <w:rPr>
+          <w:color w:val="000000" w:themeColor="text1"/>
+          <w:sz w:val="24"/>
+          <w:szCs w:val="24"/>
+        </w:rPr>
+        <w:t>initalised</w:t>
+      </w:r>
+      <w:proofErr w:type="spellEnd"/>
+      <w:r>
+        <w:rPr>
+          <w:color w:val="000000" w:themeColor="text1"/>
+          <w:sz w:val="24"/>
+          <w:szCs w:val="24"/>
+        </w:rPr>
+        <w:t xml:space="preserve"> as 3 in the </w:t>
+      </w:r>
+      <w:r>
+        <w:rPr>
+          <w:color w:val="000000" w:themeColor="text1"/>
+          <w:sz w:val="24"/>
+          <w:szCs w:val="24"/>
+        </w:rPr>
+        <w:t>constructor.</w:t>
+      </w:r>
+      <w:r>
+        <w:rPr>
+          <w:color w:val="000000" w:themeColor="text1"/>
+          <w:sz w:val="24"/>
+          <w:szCs w:val="24"/>
+        </w:rPr>
+        <w:t xml:space="preserve"> </w:t>
+      </w:r>
+      <w:r>
+        <w:rPr>
+          <w:color w:val="000000" w:themeColor="text1"/>
+          <w:sz w:val="24"/>
+          <w:szCs w:val="24"/>
+        </w:rPr>
+        <w:t>The new object is also given a unique ID as to not overlap with any other object.</w:t>
+      </w:r>
+      <w:r>
+        <w:rPr>
+          <w:color w:val="000000" w:themeColor="text1"/>
+          <w:sz w:val="24"/>
+          <w:szCs w:val="24"/>
+        </w:rPr>
+        <w:t xml:space="preserve"> The </w:t>
+      </w:r>
+      <w:proofErr w:type="spellStart"/>
+      <w:r>
+        <w:rPr>
+          <w:color w:val="000000" w:themeColor="text1"/>
+          <w:sz w:val="24"/>
+          <w:szCs w:val="24"/>
+        </w:rPr>
+        <w:t>GetNewID</w:t>
+      </w:r>
+      <w:proofErr w:type="spellEnd"/>
+      <w:r>
+        <w:rPr>
+          <w:color w:val="000000" w:themeColor="text1"/>
+          <w:sz w:val="24"/>
+          <w:szCs w:val="24"/>
+        </w:rPr>
+        <w:t xml:space="preserve"> function is called which contains a max algorithm that finds the highest ID plus 1.</w:t>
+      </w:r>
+      <w:r>
+        <w:rPr>
+          <w:color w:val="000000" w:themeColor="text1"/>
+          <w:sz w:val="24"/>
+          <w:szCs w:val="24"/>
+        </w:rPr>
+        <w:t xml:space="preserve"> Once this new ID is set, the new object is pushed into the scene graph so to be displayed.</w:t>
+      </w:r>
+      <w:r>
+        <w:rPr>
+          <w:color w:val="000000" w:themeColor="text1"/>
+          <w:sz w:val="24"/>
+          <w:szCs w:val="24"/>
+        </w:rPr>
+        <w:t xml:space="preserve"> The </w:t>
+      </w:r>
+      <w:proofErr w:type="spellStart"/>
+      <w:r>
+        <w:rPr>
+          <w:color w:val="000000" w:themeColor="text1"/>
+          <w:sz w:val="24"/>
+          <w:szCs w:val="24"/>
         </w:rPr>
         <w:t>pasteExtraSpace</w:t>
       </w:r>
-      <w:r>
-        <w:rPr>
-          <w:sz w:val="26"/>
-          <w:szCs w:val="26"/>
-        </w:rPr>
-        <w:t xml:space="preserve">Base, which is initalised as 3 in the </w:t>
-      </w:r>
-      <w:r>
-        <w:rPr>
-          <w:sz w:val="26"/>
-          <w:szCs w:val="26"/>
-        </w:rPr>
-        <w:t>constructor.</w:t>
-      </w:r>
-      <w:r>
-        <w:rPr>
-          <w:sz w:val="26"/>
-          <w:szCs w:val="26"/>
-        </w:rPr>
-        <w:t xml:space="preserve"> </w:t>
-      </w:r>
-      <w:r>
-        <w:rPr>
-          <w:sz w:val="26"/>
-          <w:szCs w:val="26"/>
-        </w:rPr>
-        <w:t xml:space="preserve">The new object </w:t>
-      </w:r>
-      <w:r>
-        <w:rPr>
-          <w:sz w:val="26"/>
-          <w:szCs w:val="26"/>
+      <w:proofErr w:type="spellEnd"/>
+      <w:r>
+        <w:rPr>
+          <w:color w:val="000000" w:themeColor="text1"/>
+          <w:sz w:val="24"/>
+          <w:szCs w:val="24"/>
+        </w:rPr>
+        <w:t xml:space="preserve"> variable is then incremented by </w:t>
+      </w:r>
+      <w:proofErr w:type="spellStart"/>
+      <w:r>
+        <w:rPr>
+          <w:color w:val="000000" w:themeColor="text1"/>
+          <w:sz w:val="24"/>
+          <w:szCs w:val="24"/>
+        </w:rPr>
+        <w:t>pasteExtraSpaceBase</w:t>
+      </w:r>
+      <w:proofErr w:type="spellEnd"/>
+      <w:r>
+        <w:rPr>
+          <w:color w:val="000000" w:themeColor="text1"/>
+          <w:sz w:val="24"/>
+          <w:szCs w:val="24"/>
+        </w:rPr>
+        <w:t xml:space="preserve"> so that if another of the same object is pasted, it will appear even higher than the last one. This all leaves the user with</w:t>
+      </w:r>
+      <w:r>
+        <w:rPr>
+          <w:color w:val="000000" w:themeColor="text1"/>
+          <w:sz w:val="24"/>
+          <w:szCs w:val="24"/>
+        </w:rPr>
+        <w:t xml:space="preserve"> a copy of the object they copied 3 units above the copied objects original position</w:t>
+      </w:r>
+      <w:r>
+        <w:rPr>
+          <w:color w:val="000000" w:themeColor="text1"/>
+          <w:sz w:val="24"/>
+          <w:szCs w:val="24"/>
+        </w:rPr>
+        <w:t>, or higher depending on how many times they have copied it.</w:t>
+      </w:r>
+    </w:p>
+    <w:p>
+      <w:pPr>
+        <w:keepNext/>
+        <w:spacing w:line="276" w:lineRule="auto"/>
+      </w:pPr>
+      <w:r>
+        <w:rPr>
+          <w:noProof/>
         </w:rPr>
         <w:lastRenderedPageBreak/>
-        <w:t>is also given a unique ID as to not overlap with any other object.</w:t>
-      </w:r>
-      <w:r>
-        <w:rPr>
-          <w:sz w:val="26"/>
-          <w:szCs w:val="26"/>
-        </w:rPr>
-        <w:t xml:space="preserve"> The GetNewID function is called which contains a max algorithm that finds the highest ID plus 1.</w:t>
-      </w:r>
-      <w:r>
-        <w:rPr>
-          <w:sz w:val="26"/>
-          <w:szCs w:val="26"/>
-        </w:rPr>
-        <w:t xml:space="preserve"> </w:t>
-      </w:r>
-      <w:r>
-        <w:rPr>
-          <w:sz w:val="26"/>
-          <w:szCs w:val="26"/>
-        </w:rPr>
-        <w:t>Once this new ID is set, the new object is pushed into the scene graph</w:t>
-      </w:r>
-      <w:r>
-        <w:rPr>
-          <w:sz w:val="26"/>
-          <w:szCs w:val="26"/>
-        </w:rPr>
-        <w:t xml:space="preserve"> so to be displayed.</w:t>
-      </w:r>
-      <w:r>
-        <w:rPr>
-          <w:sz w:val="26"/>
-          <w:szCs w:val="26"/>
-        </w:rPr>
-        <w:t xml:space="preserve"> The </w:t>
-      </w:r>
-      <w:r>
-        <w:rPr>
-          <w:sz w:val="26"/>
-          <w:szCs w:val="26"/>
-        </w:rPr>
-        <w:t>pasteExtraSpace</w:t>
-      </w:r>
-      <w:r>
-        <w:rPr>
-          <w:sz w:val="26"/>
-          <w:szCs w:val="26"/>
-        </w:rPr>
-        <w:t xml:space="preserve"> variable is then incremented by </w:t>
-      </w:r>
-      <w:r>
-        <w:rPr>
-          <w:sz w:val="26"/>
-          <w:szCs w:val="26"/>
-        </w:rPr>
-        <w:t>pasteExtraSpace</w:t>
-      </w:r>
-      <w:r>
-        <w:rPr>
-          <w:sz w:val="26"/>
-          <w:szCs w:val="26"/>
-        </w:rPr>
-        <w:t>Base so that if another of the same object is pasted, it will appear even higher than the last one. This all leaves the user with</w:t>
-      </w:r>
-      <w:r>
-        <w:rPr>
-          <w:sz w:val="26"/>
-          <w:szCs w:val="26"/>
-        </w:rPr>
-        <w:t xml:space="preserve"> a copy of the object they copied 3 units above the copied objects original position</w:t>
-      </w:r>
-      <w:r>
-        <w:rPr>
-          <w:sz w:val="26"/>
-          <w:szCs w:val="26"/>
-        </w:rPr>
-        <w:t>, or higher depending on how many times they have copied it.</w:t>
-      </w:r>
-    </w:p>
-    <w:p>
-      <w:pPr>
-        <w:spacing w:line="276" w:lineRule="auto"/>
-        <w:rPr>
-          <w:sz w:val="26"/>
-          <w:szCs w:val="26"/>
+        <w:drawing>
+          <wp:inline distT="0" distB="0" distL="0" distR="0" wp14:anchorId="764626BF" wp14:editId="7D99ABC1">
+            <wp:extent cx="5731510" cy="3554095"/>
+            <wp:effectExtent l="0" t="0" r="2540" b="8255"/>
+            <wp:docPr id="2063262089" name="Picture 1" descr="A screenshot of a video game&#10;&#10;AI-generated content may be incorrect."/>
+            <wp:cNvGraphicFramePr>
+              <a:graphicFrameLocks xmlns:a="http://schemas.openxmlformats.org/drawingml/2006/main" noChangeAspect="1"/>
+            </wp:cNvGraphicFramePr>
+            <a:graphic xmlns:a="http://schemas.openxmlformats.org/drawingml/2006/main">
+              <a:graphicData uri="http://schemas.openxmlformats.org/drawingml/2006/picture">
+                <pic:pic xmlns:pic="http://schemas.openxmlformats.org/drawingml/2006/picture">
+                  <pic:nvPicPr>
+                    <pic:cNvPr id="2063262089" name="Picture 1" descr="A screenshot of a video game&#10;&#10;AI-generated content may be incorrect."/>
+                    <pic:cNvPicPr/>
+                  </pic:nvPicPr>
+                  <pic:blipFill>
+                    <a:blip r:embed="rId5"/>
+                    <a:stretch>
+                      <a:fillRect/>
+                    </a:stretch>
+                  </pic:blipFill>
+                  <pic:spPr>
+                    <a:xfrm>
+                      <a:off x="0" y="0"/>
+                      <a:ext cx="5731510" cy="3554095"/>
+                    </a:xfrm>
+                    <a:prstGeom prst="rect">
+                      <a:avLst/>
+                    </a:prstGeom>
+                  </pic:spPr>
+                </pic:pic>
+              </a:graphicData>
+            </a:graphic>
+          </wp:inline>
+        </w:drawing>
+      </w:r>
+    </w:p>
+    <w:p>
+      <w:pPr>
+        <w:pStyle w:val="Caption"/>
+        <w:jc w:val="center"/>
+        <w:rPr>
+          <w:rFonts w:ascii="Arial" w:hAnsi="Arial" w:cs="Arial"/>
+          <w:color w:val="000000" w:themeColor="text1"/>
+          <w:sz w:val="36"/>
+          <w:szCs w:val="36"/>
+        </w:rPr>
+      </w:pPr>
+      <w:r>
+        <w:rPr>
+          <w:rFonts w:ascii="Arial" w:hAnsi="Arial" w:cs="Arial"/>
+          <w:color w:val="000000" w:themeColor="text1"/>
+          <w:sz w:val="24"/>
+          <w:szCs w:val="24"/>
+        </w:rPr>
+        <w:t xml:space="preserve">Figure </w:t>
+      </w:r>
+      <w:r>
+        <w:rPr>
+          <w:rFonts w:ascii="Arial" w:hAnsi="Arial" w:cs="Arial"/>
+          <w:color w:val="000000" w:themeColor="text1"/>
+          <w:sz w:val="24"/>
+          <w:szCs w:val="24"/>
+        </w:rPr>
+        <w:fldChar w:fldCharType="begin"/>
+      </w:r>
+      <w:r>
+        <w:rPr>
+          <w:rFonts w:ascii="Arial" w:hAnsi="Arial" w:cs="Arial"/>
+          <w:color w:val="000000" w:themeColor="text1"/>
+          <w:sz w:val="24"/>
+          <w:szCs w:val="24"/>
+        </w:rPr>
+        <w:instrText xml:space="preserve"> SEQ Figure \* ARABIC </w:instrText>
+      </w:r>
+      <w:r>
+        <w:rPr>
+          <w:rFonts w:ascii="Arial" w:hAnsi="Arial" w:cs="Arial"/>
+          <w:color w:val="000000" w:themeColor="text1"/>
+          <w:sz w:val="24"/>
+          <w:szCs w:val="24"/>
+        </w:rPr>
+        <w:fldChar w:fldCharType="separate"/>
+      </w:r>
+      <w:r>
+        <w:rPr>
+          <w:rFonts w:ascii="Arial" w:hAnsi="Arial" w:cs="Arial"/>
+          <w:noProof/>
+          <w:color w:val="000000" w:themeColor="text1"/>
+          <w:sz w:val="24"/>
+          <w:szCs w:val="24"/>
+        </w:rPr>
+        <w:t>1</w:t>
+      </w:r>
+      <w:r>
+        <w:rPr>
+          <w:rFonts w:ascii="Arial" w:hAnsi="Arial" w:cs="Arial"/>
+          <w:color w:val="000000" w:themeColor="text1"/>
+          <w:sz w:val="24"/>
+          <w:szCs w:val="24"/>
+        </w:rPr>
+        <w:fldChar w:fldCharType="end"/>
+      </w:r>
+      <w:r>
+        <w:rPr>
+          <w:rFonts w:ascii="Arial" w:hAnsi="Arial" w:cs="Arial"/>
+          <w:color w:val="000000" w:themeColor="text1"/>
+          <w:sz w:val="24"/>
+          <w:szCs w:val="24"/>
+        </w:rPr>
+        <w:t>: An object and its copy</w:t>
+      </w:r>
+    </w:p>
+    <w:p>
+      <w:pPr>
+        <w:spacing w:line="276" w:lineRule="auto"/>
+        <w:rPr>
+          <w:color w:val="000000" w:themeColor="text1"/>
+          <w:sz w:val="24"/>
+          <w:szCs w:val="24"/>
         </w:rPr>
       </w:pPr>
     </w:p>
@@ -908,8 +1565,8 @@
           <w:b/>
           <w:bCs/>
           <w:color w:val="000000" w:themeColor="text1"/>
-          <w:sz w:val="26"/>
-          <w:szCs w:val="26"/>
+          <w:sz w:val="28"/>
+          <w:szCs w:val="28"/>
         </w:rPr>
       </w:pPr>
       <w:r>
@@ -918,8 +1575,8 @@
           <w:b/>
           <w:bCs/>
           <w:color w:val="000000" w:themeColor="text1"/>
-          <w:sz w:val="26"/>
-          <w:szCs w:val="26"/>
+          <w:sz w:val="28"/>
+          <w:szCs w:val="28"/>
         </w:rPr>
         <w:t>Delete:</w:t>
       </w:r>
@@ -929,18 +1586,89 @@
         <w:spacing w:line="276" w:lineRule="auto"/>
         <w:rPr>
           <w:rFonts w:ascii="Arial" w:hAnsi="Arial" w:cs="Arial"/>
-          <w:sz w:val="26"/>
-          <w:szCs w:val="26"/>
-        </w:rPr>
-      </w:pPr>
-    </w:p>
-    <w:p>
-      <w:pPr>
-        <w:spacing w:line="276" w:lineRule="auto"/>
-        <w:rPr>
-          <w:rFonts w:ascii="Arial" w:hAnsi="Arial" w:cs="Arial"/>
-          <w:sz w:val="26"/>
-          <w:szCs w:val="26"/>
+          <w:color w:val="000000" w:themeColor="text1"/>
+          <w:sz w:val="24"/>
+          <w:szCs w:val="24"/>
+        </w:rPr>
+      </w:pPr>
+      <w:r>
+        <w:rPr>
+          <w:rFonts w:ascii="Arial" w:hAnsi="Arial" w:cs="Arial"/>
+          <w:color w:val="000000" w:themeColor="text1"/>
+          <w:sz w:val="24"/>
+          <w:szCs w:val="24"/>
+        </w:rPr>
+        <w:t xml:space="preserve">Deleting items is a feature present in almost every piece software. It is an incredibly important function to have as it allows users to remove things they no longer wish to be present in the scene. This is either because they made a mistake, or they simply don’t like the object or don’t need it anymore. The key bind that users can delete items with is pressing the delete key while selecting an item. While this deletes the item, it is an undoable action and so can be fixed if the user changes their mind or accidentally deleted it. The code for deleting objects is as follows: once the user has pressed backspace, the </w:t>
+      </w:r>
+      <w:proofErr w:type="spellStart"/>
+      <w:r>
+        <w:rPr>
+          <w:rFonts w:ascii="Arial" w:hAnsi="Arial" w:cs="Arial"/>
+          <w:color w:val="000000" w:themeColor="text1"/>
+          <w:sz w:val="24"/>
+          <w:szCs w:val="24"/>
+        </w:rPr>
+        <w:t>DeleteObject</w:t>
+      </w:r>
+      <w:proofErr w:type="spellEnd"/>
+      <w:r>
+        <w:rPr>
+          <w:rFonts w:ascii="Arial" w:hAnsi="Arial" w:cs="Arial"/>
+          <w:color w:val="000000" w:themeColor="text1"/>
+          <w:sz w:val="24"/>
+          <w:szCs w:val="24"/>
+        </w:rPr>
+        <w:t xml:space="preserve"> function is called in the game class. Inside this function, an if statement checks if the current selection is valid, being between 0 and the size of the scene graph. If this is true, </w:t>
+      </w:r>
+      <w:proofErr w:type="spellStart"/>
+      <w:r>
+        <w:rPr>
+          <w:rFonts w:ascii="Arial" w:hAnsi="Arial" w:cs="Arial"/>
+          <w:color w:val="000000" w:themeColor="text1"/>
+          <w:sz w:val="24"/>
+          <w:szCs w:val="24"/>
+        </w:rPr>
+        <w:t>addUndo</w:t>
+      </w:r>
+      <w:proofErr w:type="spellEnd"/>
+      <w:r>
+        <w:rPr>
+          <w:rFonts w:ascii="Arial" w:hAnsi="Arial" w:cs="Arial"/>
+          <w:color w:val="000000" w:themeColor="text1"/>
+          <w:sz w:val="24"/>
+          <w:szCs w:val="24"/>
+        </w:rPr>
+        <w:t xml:space="preserve"> is called in the tool main, as deleting is an undoable action. Then, the object in the scene graph at the position of the </w:t>
+      </w:r>
+      <w:proofErr w:type="spellStart"/>
+      <w:r>
+        <w:rPr>
+          <w:rFonts w:ascii="Arial" w:hAnsi="Arial" w:cs="Arial"/>
+          <w:color w:val="000000" w:themeColor="text1"/>
+          <w:sz w:val="24"/>
+          <w:szCs w:val="24"/>
+        </w:rPr>
+        <w:t>selectedID</w:t>
+      </w:r>
+      <w:proofErr w:type="spellEnd"/>
+      <w:r>
+        <w:rPr>
+          <w:rFonts w:ascii="Arial" w:hAnsi="Arial" w:cs="Arial"/>
+          <w:color w:val="000000" w:themeColor="text1"/>
+          <w:sz w:val="24"/>
+          <w:szCs w:val="24"/>
+        </w:rPr>
+        <w:t xml:space="preserve"> is erased. After this, the selected ID is set to -2. This is a small failsafe just in case, it makes sure that the user must click on another object to delete it in case they press backspace twice and accidentally delete multiple objects.</w:t>
+      </w:r>
+    </w:p>
+    <w:p>
+      <w:pPr>
+        <w:spacing w:line="276" w:lineRule="auto"/>
+        <w:rPr>
+          <w:rFonts w:ascii="Arial" w:hAnsi="Arial" w:cs="Arial"/>
+          <w:color w:val="000000" w:themeColor="text1"/>
+          <w:sz w:val="24"/>
+          <w:szCs w:val="24"/>
         </w:rPr>
       </w:pPr>
     </w:p>
@@ -953,8 +1681,8 @@
           <w:b/>
           <w:bCs/>
           <w:color w:val="000000" w:themeColor="text1"/>
-          <w:sz w:val="26"/>
-          <w:szCs w:val="26"/>
+          <w:sz w:val="28"/>
+          <w:szCs w:val="28"/>
         </w:rPr>
       </w:pPr>
       <w:r>
@@ -963,8 +1691,8 @@
           <w:b/>
           <w:bCs/>
           <w:color w:val="000000" w:themeColor="text1"/>
-          <w:sz w:val="26"/>
-          <w:szCs w:val="26"/>
+          <w:sz w:val="28"/>
+          <w:szCs w:val="28"/>
         </w:rPr>
         <w:t>Undo / Redo:</w:t>
       </w:r>
@@ -974,32 +1702,126 @@
         <w:spacing w:line="276" w:lineRule="auto"/>
         <w:rPr>
           <w:rFonts w:ascii="Arial" w:hAnsi="Arial" w:cs="Arial"/>
-          <w:sz w:val="26"/>
-          <w:szCs w:val="26"/>
-        </w:rPr>
-      </w:pPr>
-    </w:p>
-    <w:p>
-      <w:pPr>
-        <w:spacing w:line="276" w:lineRule="auto"/>
-        <w:rPr>
-          <w:rFonts w:ascii="Arial" w:hAnsi="Arial" w:cs="Arial"/>
-          <w:sz w:val="26"/>
-          <w:szCs w:val="26"/>
-        </w:rPr>
-      </w:pPr>
-    </w:p>
-    <w:p>
-      <w:pPr>
-        <w:pStyle w:val="Heading1"/>
-        <w:spacing w:line="276" w:lineRule="auto"/>
+          <w:color w:val="000000" w:themeColor="text1"/>
+          <w:sz w:val="24"/>
+          <w:szCs w:val="24"/>
+        </w:rPr>
+      </w:pPr>
+      <w:r>
+        <w:rPr>
+          <w:rFonts w:ascii="Arial" w:hAnsi="Arial" w:cs="Arial"/>
+          <w:color w:val="000000" w:themeColor="text1"/>
+          <w:sz w:val="24"/>
+          <w:szCs w:val="24"/>
+        </w:rPr>
+        <w:t xml:space="preserve">The ability to undo actions is a key feature is many pieces of industry standard software. The most common shortcut for this is left control and Z. A user would </w:t>
+      </w:r>
+      <w:r>
+        <w:rPr>
+          <w:rFonts w:ascii="Arial" w:hAnsi="Arial" w:cs="Arial"/>
+          <w:color w:val="000000" w:themeColor="text1"/>
+          <w:sz w:val="24"/>
+          <w:szCs w:val="24"/>
+        </w:rPr>
+        <w:lastRenderedPageBreak/>
+        <w:t>access this feature if they had made an edit to the scene that was either accidental, or they did not like it and wanted to try again. This feature was developed twice, the first time it was cumbersome and difficult to scale to new features and so was discarded in place of a much easier, cleaner and suitable method of undoing.</w:t>
+      </w:r>
+      <w:r>
+        <w:rPr>
+          <w:rFonts w:ascii="Arial" w:hAnsi="Arial" w:cs="Arial"/>
+          <w:color w:val="000000" w:themeColor="text1"/>
+          <w:sz w:val="24"/>
+          <w:szCs w:val="24"/>
+        </w:rPr>
+        <w:t xml:space="preserve"> Both methods I implemented will be discussed.</w:t>
+      </w:r>
+      <w:r>
+        <w:rPr>
+          <w:rFonts w:ascii="Arial" w:hAnsi="Arial" w:cs="Arial"/>
+          <w:color w:val="000000" w:themeColor="text1"/>
+          <w:sz w:val="24"/>
+          <w:szCs w:val="24"/>
+        </w:rPr>
+        <w:t xml:space="preserve"> </w:t>
+      </w:r>
+    </w:p>
+    <w:p>
+      <w:pPr>
+        <w:spacing w:line="276" w:lineRule="auto"/>
+        <w:rPr>
+          <w:rFonts w:ascii="Arial" w:hAnsi="Arial" w:cs="Arial"/>
+          <w:color w:val="000000" w:themeColor="text1"/>
+          <w:sz w:val="24"/>
+          <w:szCs w:val="24"/>
+        </w:rPr>
+      </w:pPr>
+      <w:r>
+        <w:rPr>
+          <w:rFonts w:ascii="Arial" w:hAnsi="Arial" w:cs="Arial"/>
+          <w:color w:val="000000" w:themeColor="text1"/>
+          <w:sz w:val="24"/>
+          <w:szCs w:val="24"/>
+        </w:rPr>
+        <w:t xml:space="preserve">Redo is the inverse of undo and is similarly present </w:t>
+      </w:r>
+      <w:r>
+        <w:rPr>
+          <w:rFonts w:ascii="Arial" w:hAnsi="Arial" w:cs="Arial"/>
+          <w:color w:val="000000" w:themeColor="text1"/>
+          <w:sz w:val="24"/>
+          <w:szCs w:val="24"/>
+        </w:rPr>
+        <w:t>in a large amount of software</w:t>
+      </w:r>
+      <w:r>
+        <w:rPr>
+          <w:rFonts w:ascii="Arial" w:hAnsi="Arial" w:cs="Arial"/>
+          <w:color w:val="000000" w:themeColor="text1"/>
+          <w:sz w:val="24"/>
+          <w:szCs w:val="24"/>
+        </w:rPr>
+        <w:t>. Typically left control + Y is used to access this feature.</w:t>
+      </w:r>
+      <w:r>
+        <w:rPr>
+          <w:rFonts w:ascii="Arial" w:hAnsi="Arial" w:cs="Arial"/>
+          <w:color w:val="000000" w:themeColor="text1"/>
+          <w:sz w:val="24"/>
+          <w:szCs w:val="24"/>
+        </w:rPr>
+        <w:t xml:space="preserve"> The redo function is used to revert an undo in case a user undid </w:t>
+      </w:r>
+      <w:r>
+        <w:rPr>
+          <w:rFonts w:ascii="Arial" w:hAnsi="Arial" w:cs="Arial"/>
+          <w:color w:val="000000" w:themeColor="text1"/>
+          <w:sz w:val="24"/>
+          <w:szCs w:val="24"/>
+        </w:rPr>
+        <w:t>too many edits.</w:t>
+      </w:r>
+    </w:p>
+    <w:p>
+      <w:pPr>
+        <w:spacing w:line="276" w:lineRule="auto"/>
+        <w:rPr>
+          <w:rFonts w:ascii="Arial" w:hAnsi="Arial" w:cs="Arial"/>
+          <w:color w:val="000000" w:themeColor="text1"/>
+          <w:sz w:val="24"/>
+          <w:szCs w:val="24"/>
+        </w:rPr>
+      </w:pPr>
+    </w:p>
+    <w:p>
+      <w:pPr>
+        <w:pStyle w:val="Heading2"/>
         <w:rPr>
           <w:rFonts w:ascii="Arial" w:hAnsi="Arial" w:cs="Arial"/>
           <w:b/>
           <w:bCs/>
           <w:color w:val="000000" w:themeColor="text1"/>
-          <w:sz w:val="26"/>
-          <w:szCs w:val="26"/>
+          <w:sz w:val="24"/>
+          <w:szCs w:val="24"/>
         </w:rPr>
       </w:pPr>
       <w:r>
@@ -1008,53 +1830,1016 @@
           <w:b/>
           <w:bCs/>
           <w:color w:val="000000" w:themeColor="text1"/>
-          <w:sz w:val="26"/>
-          <w:szCs w:val="26"/>
-        </w:rPr>
-        <w:t>Object Editor:</w:t>
-      </w:r>
-    </w:p>
-    <w:p>
-      <w:pPr>
-        <w:spacing w:line="276" w:lineRule="auto"/>
-        <w:rPr>
-          <w:rFonts w:ascii="Arial" w:hAnsi="Arial" w:cs="Arial"/>
-          <w:sz w:val="26"/>
-          <w:szCs w:val="26"/>
-        </w:rPr>
-      </w:pPr>
-    </w:p>
-    <w:p>
-      <w:pPr>
-        <w:spacing w:line="276" w:lineRule="auto"/>
-        <w:rPr>
-          <w:rFonts w:ascii="Arial" w:hAnsi="Arial" w:cs="Arial"/>
-          <w:sz w:val="26"/>
-          <w:szCs w:val="26"/>
-        </w:rPr>
-      </w:pPr>
-    </w:p>
-    <w:p>
-      <w:pPr>
-        <w:pStyle w:val="Heading1"/>
+          <w:sz w:val="24"/>
+          <w:szCs w:val="24"/>
+        </w:rPr>
+        <w:t>Legacy Undo</w:t>
+      </w:r>
+    </w:p>
+    <w:p>
+      <w:pPr>
+        <w:spacing w:line="276" w:lineRule="auto"/>
+        <w:rPr>
+          <w:rFonts w:ascii="Arial" w:hAnsi="Arial" w:cs="Arial"/>
+          <w:color w:val="000000" w:themeColor="text1"/>
+          <w:sz w:val="24"/>
+          <w:szCs w:val="24"/>
+        </w:rPr>
+      </w:pPr>
+      <w:r>
+        <w:rPr>
+          <w:rFonts w:ascii="Arial" w:hAnsi="Arial" w:cs="Arial"/>
+          <w:color w:val="000000" w:themeColor="text1"/>
+          <w:sz w:val="24"/>
+          <w:szCs w:val="24"/>
+        </w:rPr>
+        <w:t xml:space="preserve">Originally, two parallel vectors were created, </w:t>
+      </w:r>
+      <w:proofErr w:type="spellStart"/>
+      <w:r>
+        <w:rPr>
+          <w:rFonts w:ascii="Arial" w:hAnsi="Arial" w:cs="Arial"/>
+          <w:color w:val="000000" w:themeColor="text1"/>
+          <w:sz w:val="24"/>
+          <w:szCs w:val="24"/>
+        </w:rPr>
+        <w:t>undoObject</w:t>
+      </w:r>
+      <w:proofErr w:type="spellEnd"/>
+      <w:r>
+        <w:rPr>
+          <w:rFonts w:ascii="Arial" w:hAnsi="Arial" w:cs="Arial"/>
+          <w:color w:val="000000" w:themeColor="text1"/>
+          <w:sz w:val="24"/>
+          <w:szCs w:val="24"/>
+        </w:rPr>
+        <w:t xml:space="preserve"> and </w:t>
+      </w:r>
+      <w:proofErr w:type="spellStart"/>
+      <w:r>
+        <w:rPr>
+          <w:rFonts w:ascii="Arial" w:hAnsi="Arial" w:cs="Arial"/>
+          <w:color w:val="000000" w:themeColor="text1"/>
+          <w:sz w:val="24"/>
+          <w:szCs w:val="24"/>
+        </w:rPr>
+        <w:t>undoActions</w:t>
+      </w:r>
+      <w:proofErr w:type="spellEnd"/>
+      <w:r>
+        <w:rPr>
+          <w:rFonts w:ascii="Arial" w:hAnsi="Arial" w:cs="Arial"/>
+          <w:color w:val="000000" w:themeColor="text1"/>
+          <w:sz w:val="24"/>
+          <w:szCs w:val="24"/>
+        </w:rPr>
+        <w:t xml:space="preserve">. </w:t>
+      </w:r>
+      <w:proofErr w:type="spellStart"/>
+      <w:r>
+        <w:rPr>
+          <w:rFonts w:ascii="Arial" w:hAnsi="Arial" w:cs="Arial"/>
+          <w:color w:val="000000" w:themeColor="text1"/>
+          <w:sz w:val="24"/>
+          <w:szCs w:val="24"/>
+        </w:rPr>
+        <w:t>undoObject</w:t>
+      </w:r>
+      <w:proofErr w:type="spellEnd"/>
+      <w:r>
+        <w:rPr>
+          <w:rFonts w:ascii="Arial" w:hAnsi="Arial" w:cs="Arial"/>
+          <w:color w:val="000000" w:themeColor="text1"/>
+          <w:sz w:val="24"/>
+          <w:szCs w:val="24"/>
+        </w:rPr>
+        <w:t xml:space="preserve"> was a vector of </w:t>
+      </w:r>
+      <w:r>
+        <w:rPr>
+          <w:rFonts w:ascii="Arial" w:hAnsi="Arial" w:cs="Arial"/>
+          <w:color w:val="000000" w:themeColor="text1"/>
+          <w:sz w:val="24"/>
+          <w:szCs w:val="24"/>
+        </w:rPr>
+        <w:t xml:space="preserve">scene objects and </w:t>
+      </w:r>
+      <w:proofErr w:type="spellStart"/>
+      <w:r>
+        <w:rPr>
+          <w:rFonts w:ascii="Arial" w:hAnsi="Arial" w:cs="Arial"/>
+          <w:color w:val="000000" w:themeColor="text1"/>
+          <w:sz w:val="24"/>
+          <w:szCs w:val="24"/>
+        </w:rPr>
+        <w:t>undoActions</w:t>
+      </w:r>
+      <w:proofErr w:type="spellEnd"/>
+      <w:r>
+        <w:rPr>
+          <w:rFonts w:ascii="Arial" w:hAnsi="Arial" w:cs="Arial"/>
+          <w:color w:val="000000" w:themeColor="text1"/>
+          <w:sz w:val="24"/>
+          <w:szCs w:val="24"/>
+        </w:rPr>
+        <w:t xml:space="preserve"> was of integers</w:t>
+      </w:r>
+      <w:r>
+        <w:rPr>
+          <w:rFonts w:ascii="Arial" w:hAnsi="Arial" w:cs="Arial"/>
+          <w:color w:val="000000" w:themeColor="text1"/>
+          <w:sz w:val="24"/>
+          <w:szCs w:val="24"/>
+        </w:rPr>
+        <w:t xml:space="preserve">. The thought behind this was that whenever an undoable action was </w:t>
+      </w:r>
+      <w:r>
+        <w:rPr>
+          <w:rFonts w:ascii="Arial" w:hAnsi="Arial" w:cs="Arial"/>
+          <w:color w:val="000000" w:themeColor="text1"/>
+          <w:sz w:val="24"/>
+          <w:szCs w:val="24"/>
+        </w:rPr>
+        <w:t>done</w:t>
+      </w:r>
+      <w:r>
+        <w:rPr>
+          <w:rFonts w:ascii="Arial" w:hAnsi="Arial" w:cs="Arial"/>
+          <w:color w:val="000000" w:themeColor="text1"/>
+          <w:sz w:val="24"/>
+          <w:szCs w:val="24"/>
+        </w:rPr>
+        <w:t xml:space="preserve">, the </w:t>
+      </w:r>
+      <w:r>
+        <w:rPr>
+          <w:rFonts w:ascii="Arial" w:hAnsi="Arial" w:cs="Arial"/>
+          <w:color w:val="000000" w:themeColor="text1"/>
+          <w:sz w:val="24"/>
+          <w:szCs w:val="24"/>
+        </w:rPr>
+        <w:t xml:space="preserve">relevant object (one being deleted or pasted) </w:t>
+      </w:r>
+      <w:r>
+        <w:rPr>
+          <w:rFonts w:ascii="Arial" w:hAnsi="Arial" w:cs="Arial"/>
+          <w:color w:val="000000" w:themeColor="text1"/>
+          <w:sz w:val="24"/>
+          <w:szCs w:val="24"/>
+        </w:rPr>
+        <w:t xml:space="preserve">would be added to the </w:t>
+      </w:r>
+      <w:proofErr w:type="spellStart"/>
+      <w:r>
+        <w:rPr>
+          <w:rFonts w:ascii="Arial" w:hAnsi="Arial" w:cs="Arial"/>
+          <w:color w:val="000000" w:themeColor="text1"/>
+          <w:sz w:val="24"/>
+          <w:szCs w:val="24"/>
+        </w:rPr>
+        <w:t>undoObject</w:t>
+      </w:r>
+      <w:proofErr w:type="spellEnd"/>
+      <w:r>
+        <w:rPr>
+          <w:rFonts w:ascii="Arial" w:hAnsi="Arial" w:cs="Arial"/>
+          <w:color w:val="000000" w:themeColor="text1"/>
+          <w:sz w:val="24"/>
+          <w:szCs w:val="24"/>
+        </w:rPr>
+        <w:t xml:space="preserve"> vector and the related action would be added to the </w:t>
+      </w:r>
+      <w:proofErr w:type="spellStart"/>
+      <w:r>
+        <w:rPr>
+          <w:rFonts w:ascii="Arial" w:hAnsi="Arial" w:cs="Arial"/>
+          <w:color w:val="000000" w:themeColor="text1"/>
+          <w:sz w:val="24"/>
+          <w:szCs w:val="24"/>
+        </w:rPr>
+        <w:t>undoActions</w:t>
+      </w:r>
+      <w:proofErr w:type="spellEnd"/>
+      <w:r>
+        <w:rPr>
+          <w:rFonts w:ascii="Arial" w:hAnsi="Arial" w:cs="Arial"/>
+          <w:color w:val="000000" w:themeColor="text1"/>
+          <w:sz w:val="24"/>
+          <w:szCs w:val="24"/>
+        </w:rPr>
+        <w:t xml:space="preserve"> vector, </w:t>
+      </w:r>
+      <w:r>
+        <w:rPr>
+          <w:rFonts w:ascii="Arial" w:hAnsi="Arial" w:cs="Arial"/>
+          <w:color w:val="000000" w:themeColor="text1"/>
+          <w:sz w:val="24"/>
+          <w:szCs w:val="24"/>
+        </w:rPr>
+        <w:t>0 meaning the object was going to be deleted and 1 meaning that it was being created/pasted.</w:t>
+      </w:r>
+      <w:r>
+        <w:rPr>
+          <w:rFonts w:ascii="Arial" w:hAnsi="Arial" w:cs="Arial"/>
+          <w:color w:val="000000" w:themeColor="text1"/>
+          <w:sz w:val="24"/>
+          <w:szCs w:val="24"/>
+        </w:rPr>
+        <w:t xml:space="preserve"> Inside the </w:t>
+      </w:r>
+      <w:proofErr w:type="spellStart"/>
+      <w:r>
+        <w:rPr>
+          <w:rFonts w:ascii="Arial" w:hAnsi="Arial" w:cs="Arial"/>
+          <w:color w:val="000000" w:themeColor="text1"/>
+          <w:sz w:val="24"/>
+          <w:szCs w:val="24"/>
+        </w:rPr>
+        <w:t>UndoObject</w:t>
+      </w:r>
+      <w:proofErr w:type="spellEnd"/>
+      <w:r>
+        <w:rPr>
+          <w:rFonts w:ascii="Arial" w:hAnsi="Arial" w:cs="Arial"/>
+          <w:color w:val="000000" w:themeColor="text1"/>
+          <w:sz w:val="24"/>
+          <w:szCs w:val="24"/>
+        </w:rPr>
+        <w:t xml:space="preserve"> function in the game class, a check was done if the </w:t>
+      </w:r>
+      <w:proofErr w:type="spellStart"/>
+      <w:r>
+        <w:rPr>
+          <w:rFonts w:ascii="Arial" w:hAnsi="Arial" w:cs="Arial"/>
+          <w:color w:val="000000" w:themeColor="text1"/>
+          <w:sz w:val="24"/>
+          <w:szCs w:val="24"/>
+        </w:rPr>
+        <w:t>undoActions</w:t>
+      </w:r>
+      <w:proofErr w:type="spellEnd"/>
+      <w:r>
+        <w:rPr>
+          <w:rFonts w:ascii="Arial" w:hAnsi="Arial" w:cs="Arial"/>
+          <w:color w:val="000000" w:themeColor="text1"/>
+          <w:sz w:val="24"/>
+          <w:szCs w:val="24"/>
+        </w:rPr>
+        <w:t xml:space="preserve"> list was not empty. If </w:t>
+      </w:r>
+      <w:r>
+        <w:rPr>
+          <w:rFonts w:ascii="Arial" w:hAnsi="Arial" w:cs="Arial"/>
+          <w:color w:val="000000" w:themeColor="text1"/>
+          <w:sz w:val="24"/>
+          <w:szCs w:val="24"/>
+        </w:rPr>
+        <w:t xml:space="preserve">there was something to be undone, an if statement then </w:t>
+      </w:r>
+      <w:r>
+        <w:rPr>
+          <w:rFonts w:ascii="Arial" w:hAnsi="Arial" w:cs="Arial"/>
+          <w:color w:val="000000" w:themeColor="text1"/>
+          <w:sz w:val="24"/>
+          <w:szCs w:val="24"/>
+        </w:rPr>
+        <w:t xml:space="preserve">checked </w:t>
+      </w:r>
+      <w:r>
+        <w:rPr>
+          <w:rFonts w:ascii="Arial" w:hAnsi="Arial" w:cs="Arial"/>
+          <w:color w:val="000000" w:themeColor="text1"/>
+          <w:sz w:val="24"/>
+          <w:szCs w:val="24"/>
+        </w:rPr>
+        <w:t xml:space="preserve">what the back of the </w:t>
+      </w:r>
+      <w:proofErr w:type="spellStart"/>
+      <w:r>
+        <w:rPr>
+          <w:rFonts w:ascii="Arial" w:hAnsi="Arial" w:cs="Arial"/>
+          <w:color w:val="000000" w:themeColor="text1"/>
+          <w:sz w:val="24"/>
+          <w:szCs w:val="24"/>
+        </w:rPr>
+        <w:t>undoActions</w:t>
+      </w:r>
+      <w:proofErr w:type="spellEnd"/>
+      <w:r>
+        <w:rPr>
+          <w:rFonts w:ascii="Arial" w:hAnsi="Arial" w:cs="Arial"/>
+          <w:color w:val="000000" w:themeColor="text1"/>
+          <w:sz w:val="24"/>
+          <w:szCs w:val="24"/>
+        </w:rPr>
+        <w:t xml:space="preserve"> vector was.</w:t>
+      </w:r>
+      <w:r>
+        <w:rPr>
+          <w:rFonts w:ascii="Arial" w:hAnsi="Arial" w:cs="Arial"/>
+          <w:color w:val="000000" w:themeColor="text1"/>
+          <w:sz w:val="24"/>
+          <w:szCs w:val="24"/>
+        </w:rPr>
+        <w:t xml:space="preserve"> If it was 0, the action to be undone was a delete, meaning that an object needed to be created where the deleted one was.</w:t>
+      </w:r>
+      <w:r>
+        <w:rPr>
+          <w:rFonts w:ascii="Arial" w:hAnsi="Arial" w:cs="Arial"/>
+          <w:color w:val="000000" w:themeColor="text1"/>
+          <w:sz w:val="24"/>
+          <w:szCs w:val="24"/>
+        </w:rPr>
+        <w:t xml:space="preserve"> To do this, a new object was created and set to </w:t>
+      </w:r>
+      <w:r>
+        <w:rPr>
+          <w:rFonts w:ascii="Arial" w:hAnsi="Arial" w:cs="Arial"/>
+          <w:color w:val="000000" w:themeColor="text1"/>
+          <w:sz w:val="24"/>
+          <w:szCs w:val="24"/>
+        </w:rPr>
+        <w:t xml:space="preserve">whatever object was </w:t>
+      </w:r>
+      <w:r>
+        <w:rPr>
+          <w:rFonts w:ascii="Arial" w:hAnsi="Arial" w:cs="Arial"/>
+          <w:color w:val="000000" w:themeColor="text1"/>
+          <w:sz w:val="24"/>
+          <w:szCs w:val="24"/>
+        </w:rPr>
+        <w:t xml:space="preserve">the </w:t>
+      </w:r>
+      <w:r>
+        <w:rPr>
+          <w:rFonts w:ascii="Arial" w:hAnsi="Arial" w:cs="Arial"/>
+          <w:color w:val="000000" w:themeColor="text1"/>
+          <w:sz w:val="24"/>
+          <w:szCs w:val="24"/>
+        </w:rPr>
+        <w:t xml:space="preserve">back of the </w:t>
+      </w:r>
+      <w:proofErr w:type="spellStart"/>
+      <w:r>
+        <w:rPr>
+          <w:rFonts w:ascii="Arial" w:hAnsi="Arial" w:cs="Arial"/>
+          <w:color w:val="000000" w:themeColor="text1"/>
+          <w:sz w:val="24"/>
+          <w:szCs w:val="24"/>
+        </w:rPr>
+        <w:t>undoObject</w:t>
+      </w:r>
+      <w:proofErr w:type="spellEnd"/>
+      <w:r>
+        <w:rPr>
+          <w:rFonts w:ascii="Arial" w:hAnsi="Arial" w:cs="Arial"/>
+          <w:color w:val="000000" w:themeColor="text1"/>
+          <w:sz w:val="24"/>
+          <w:szCs w:val="24"/>
+        </w:rPr>
+        <w:t xml:space="preserve"> vector.</w:t>
+      </w:r>
+      <w:r>
+        <w:rPr>
+          <w:rFonts w:ascii="Arial" w:hAnsi="Arial" w:cs="Arial"/>
+          <w:color w:val="000000" w:themeColor="text1"/>
+          <w:sz w:val="24"/>
+          <w:szCs w:val="24"/>
+        </w:rPr>
+        <w:t xml:space="preserve"> The new object was then pushed back into the scene graph so it could display.</w:t>
+      </w:r>
+      <w:r>
+        <w:rPr>
+          <w:rFonts w:ascii="Arial" w:hAnsi="Arial" w:cs="Arial"/>
+          <w:color w:val="000000" w:themeColor="text1"/>
+          <w:sz w:val="24"/>
+          <w:szCs w:val="24"/>
+        </w:rPr>
+        <w:t xml:space="preserve"> </w:t>
+      </w:r>
+      <w:proofErr w:type="gramStart"/>
+      <w:r>
+        <w:rPr>
+          <w:rFonts w:ascii="Arial" w:hAnsi="Arial" w:cs="Arial"/>
+          <w:color w:val="000000" w:themeColor="text1"/>
+          <w:sz w:val="24"/>
+          <w:szCs w:val="24"/>
+        </w:rPr>
+        <w:t>It’s</w:t>
+      </w:r>
+      <w:proofErr w:type="gramEnd"/>
+      <w:r>
+        <w:rPr>
+          <w:rFonts w:ascii="Arial" w:hAnsi="Arial" w:cs="Arial"/>
+          <w:color w:val="000000" w:themeColor="text1"/>
+          <w:sz w:val="24"/>
+          <w:szCs w:val="24"/>
+        </w:rPr>
+        <w:t xml:space="preserve"> ID was also set to be unique (</w:t>
+      </w:r>
+      <w:r>
+        <w:rPr>
+          <w:rFonts w:ascii="Arial" w:hAnsi="Arial" w:cs="Arial"/>
+          <w:color w:val="000000" w:themeColor="text1"/>
+          <w:sz w:val="24"/>
+          <w:szCs w:val="24"/>
+        </w:rPr>
+        <w:t xml:space="preserve">the </w:t>
+      </w:r>
+      <w:proofErr w:type="spellStart"/>
+      <w:r>
+        <w:rPr>
+          <w:rFonts w:ascii="Arial" w:hAnsi="Arial" w:cs="Arial"/>
+          <w:color w:val="000000" w:themeColor="text1"/>
+          <w:sz w:val="24"/>
+          <w:szCs w:val="24"/>
+        </w:rPr>
+        <w:t>GetNewID</w:t>
+      </w:r>
+      <w:proofErr w:type="spellEnd"/>
+      <w:r>
+        <w:rPr>
+          <w:rFonts w:ascii="Arial" w:hAnsi="Arial" w:cs="Arial"/>
+          <w:color w:val="000000" w:themeColor="text1"/>
+          <w:sz w:val="24"/>
+          <w:szCs w:val="24"/>
+        </w:rPr>
+        <w:t xml:space="preserve"> function</w:t>
+      </w:r>
+      <w:r>
+        <w:rPr>
+          <w:rFonts w:ascii="Arial" w:hAnsi="Arial" w:cs="Arial"/>
+          <w:color w:val="000000" w:themeColor="text1"/>
+          <w:sz w:val="24"/>
+          <w:szCs w:val="24"/>
+        </w:rPr>
+        <w:t xml:space="preserve"> </w:t>
+      </w:r>
+      <w:r>
+        <w:rPr>
+          <w:rFonts w:ascii="Arial" w:hAnsi="Arial" w:cs="Arial"/>
+          <w:color w:val="000000" w:themeColor="text1"/>
+          <w:sz w:val="24"/>
+          <w:szCs w:val="24"/>
+        </w:rPr>
+        <w:t>was</w:t>
+      </w:r>
+      <w:r>
+        <w:rPr>
+          <w:rFonts w:ascii="Arial" w:hAnsi="Arial" w:cs="Arial"/>
+          <w:color w:val="000000" w:themeColor="text1"/>
+          <w:sz w:val="24"/>
+          <w:szCs w:val="24"/>
+        </w:rPr>
+        <w:t xml:space="preserve"> discussed </w:t>
+      </w:r>
+      <w:r>
+        <w:rPr>
+          <w:rFonts w:ascii="Arial" w:hAnsi="Arial" w:cs="Arial"/>
+          <w:color w:val="000000" w:themeColor="text1"/>
+          <w:sz w:val="24"/>
+          <w:szCs w:val="24"/>
+        </w:rPr>
+        <w:t>in the Copy/Paste section</w:t>
+      </w:r>
+      <w:r>
+        <w:rPr>
+          <w:rFonts w:ascii="Arial" w:hAnsi="Arial" w:cs="Arial"/>
+          <w:color w:val="000000" w:themeColor="text1"/>
+          <w:sz w:val="24"/>
+          <w:szCs w:val="24"/>
+        </w:rPr>
+        <w:t>).</w:t>
+      </w:r>
+      <w:r>
+        <w:rPr>
+          <w:rFonts w:ascii="Arial" w:hAnsi="Arial" w:cs="Arial"/>
+          <w:color w:val="000000" w:themeColor="text1"/>
+          <w:sz w:val="24"/>
+          <w:szCs w:val="24"/>
+        </w:rPr>
+        <w:t xml:space="preserve"> Doing this created a new object where one had previously been deleted.</w:t>
+      </w:r>
+      <w:r>
+        <w:rPr>
+          <w:rFonts w:ascii="Arial" w:hAnsi="Arial" w:cs="Arial"/>
+          <w:color w:val="000000" w:themeColor="text1"/>
+          <w:sz w:val="24"/>
+          <w:szCs w:val="24"/>
+        </w:rPr>
+        <w:t xml:space="preserve"> </w:t>
+      </w:r>
+      <w:proofErr w:type="spellStart"/>
+      <w:r>
+        <w:rPr>
+          <w:rFonts w:ascii="Arial" w:hAnsi="Arial" w:cs="Arial"/>
+          <w:color w:val="000000" w:themeColor="text1"/>
+          <w:sz w:val="24"/>
+          <w:szCs w:val="24"/>
+        </w:rPr>
+        <w:t>Pop_</w:t>
+      </w:r>
+      <w:proofErr w:type="gramStart"/>
+      <w:r>
+        <w:rPr>
+          <w:rFonts w:ascii="Arial" w:hAnsi="Arial" w:cs="Arial"/>
+          <w:color w:val="000000" w:themeColor="text1"/>
+          <w:sz w:val="24"/>
+          <w:szCs w:val="24"/>
+        </w:rPr>
+        <w:t>back</w:t>
+      </w:r>
+      <w:proofErr w:type="spellEnd"/>
+      <w:r>
+        <w:rPr>
+          <w:rFonts w:ascii="Arial" w:hAnsi="Arial" w:cs="Arial"/>
+          <w:color w:val="000000" w:themeColor="text1"/>
+          <w:sz w:val="24"/>
+          <w:szCs w:val="24"/>
+        </w:rPr>
+        <w:t>(</w:t>
+      </w:r>
+      <w:proofErr w:type="gramEnd"/>
+      <w:r>
+        <w:rPr>
+          <w:rFonts w:ascii="Arial" w:hAnsi="Arial" w:cs="Arial"/>
+          <w:color w:val="000000" w:themeColor="text1"/>
+          <w:sz w:val="24"/>
+          <w:szCs w:val="24"/>
+        </w:rPr>
+        <w:t>) was then called on both the undo vectors to remove the undo object and action to make way for the next one.</w:t>
+      </w:r>
+      <w:r>
+        <w:rPr>
+          <w:rFonts w:ascii="Arial" w:hAnsi="Arial" w:cs="Arial"/>
+          <w:color w:val="000000" w:themeColor="text1"/>
+          <w:sz w:val="24"/>
+          <w:szCs w:val="24"/>
+        </w:rPr>
+        <w:t xml:space="preserve"> If the </w:t>
+      </w:r>
+      <w:proofErr w:type="spellStart"/>
+      <w:r>
+        <w:rPr>
+          <w:rFonts w:ascii="Arial" w:hAnsi="Arial" w:cs="Arial"/>
+          <w:color w:val="000000" w:themeColor="text1"/>
+          <w:sz w:val="24"/>
+          <w:szCs w:val="24"/>
+        </w:rPr>
+        <w:t>undoAction</w:t>
+      </w:r>
+      <w:proofErr w:type="spellEnd"/>
+      <w:r>
+        <w:rPr>
+          <w:rFonts w:ascii="Arial" w:hAnsi="Arial" w:cs="Arial"/>
+          <w:color w:val="000000" w:themeColor="text1"/>
+          <w:sz w:val="24"/>
+          <w:szCs w:val="24"/>
+        </w:rPr>
+        <w:t xml:space="preserve"> was 1 instead, this meant that </w:t>
+      </w:r>
+      <w:r>
+        <w:rPr>
+          <w:rFonts w:ascii="Arial" w:hAnsi="Arial" w:cs="Arial"/>
+          <w:color w:val="000000" w:themeColor="text1"/>
+          <w:sz w:val="24"/>
+          <w:szCs w:val="24"/>
+        </w:rPr>
+        <w:t>the action to be undone was the creation of an object</w:t>
+      </w:r>
+      <w:r>
+        <w:rPr>
+          <w:rFonts w:ascii="Arial" w:hAnsi="Arial" w:cs="Arial"/>
+          <w:color w:val="000000" w:themeColor="text1"/>
+          <w:sz w:val="24"/>
+          <w:szCs w:val="24"/>
+        </w:rPr>
+        <w:t xml:space="preserve">. The ID of the back object of the </w:t>
+      </w:r>
+      <w:proofErr w:type="spellStart"/>
+      <w:r>
+        <w:rPr>
+          <w:rFonts w:ascii="Arial" w:hAnsi="Arial" w:cs="Arial"/>
+          <w:color w:val="000000" w:themeColor="text1"/>
+          <w:sz w:val="24"/>
+          <w:szCs w:val="24"/>
+        </w:rPr>
+        <w:t>undoObject</w:t>
+      </w:r>
+      <w:proofErr w:type="spellEnd"/>
+      <w:r>
+        <w:rPr>
+          <w:rFonts w:ascii="Arial" w:hAnsi="Arial" w:cs="Arial"/>
+          <w:color w:val="000000" w:themeColor="text1"/>
+          <w:sz w:val="24"/>
+          <w:szCs w:val="24"/>
+        </w:rPr>
+        <w:t xml:space="preserve"> vector was obtained</w:t>
+      </w:r>
+      <w:r>
+        <w:rPr>
+          <w:rFonts w:ascii="Arial" w:hAnsi="Arial" w:cs="Arial"/>
+          <w:color w:val="000000" w:themeColor="text1"/>
+          <w:sz w:val="24"/>
+          <w:szCs w:val="24"/>
+        </w:rPr>
+        <w:t xml:space="preserve"> in an integer called </w:t>
+      </w:r>
+      <w:proofErr w:type="spellStart"/>
+      <w:r>
+        <w:rPr>
+          <w:rFonts w:ascii="Arial" w:hAnsi="Arial" w:cs="Arial"/>
+          <w:color w:val="000000" w:themeColor="text1"/>
+          <w:sz w:val="24"/>
+          <w:szCs w:val="24"/>
+        </w:rPr>
+        <w:t>deleteID</w:t>
+      </w:r>
+      <w:proofErr w:type="spellEnd"/>
+      <w:r>
+        <w:rPr>
+          <w:rFonts w:ascii="Arial" w:hAnsi="Arial" w:cs="Arial"/>
+          <w:color w:val="000000" w:themeColor="text1"/>
+          <w:sz w:val="24"/>
+          <w:szCs w:val="24"/>
+        </w:rPr>
+        <w:t>.</w:t>
+      </w:r>
+      <w:r>
+        <w:rPr>
+          <w:rFonts w:ascii="Arial" w:hAnsi="Arial" w:cs="Arial"/>
+          <w:color w:val="000000" w:themeColor="text1"/>
+          <w:sz w:val="24"/>
+          <w:szCs w:val="24"/>
+        </w:rPr>
+        <w:t xml:space="preserve"> Looping through the scene graph, the object with </w:t>
+      </w:r>
+      <w:r>
+        <w:rPr>
+          <w:rFonts w:ascii="Arial" w:hAnsi="Arial" w:cs="Arial"/>
+          <w:color w:val="000000" w:themeColor="text1"/>
+          <w:sz w:val="24"/>
+          <w:szCs w:val="24"/>
+        </w:rPr>
+        <w:t xml:space="preserve">the same ID as </w:t>
+      </w:r>
+      <w:proofErr w:type="spellStart"/>
+      <w:r>
+        <w:rPr>
+          <w:rFonts w:ascii="Arial" w:hAnsi="Arial" w:cs="Arial"/>
+          <w:color w:val="000000" w:themeColor="text1"/>
+          <w:sz w:val="24"/>
+          <w:szCs w:val="24"/>
+        </w:rPr>
+        <w:t>deleteID</w:t>
+      </w:r>
+      <w:proofErr w:type="spellEnd"/>
+      <w:r>
+        <w:rPr>
+          <w:rFonts w:ascii="Arial" w:hAnsi="Arial" w:cs="Arial"/>
+          <w:color w:val="000000" w:themeColor="text1"/>
+          <w:sz w:val="24"/>
+          <w:szCs w:val="24"/>
+        </w:rPr>
+        <w:t xml:space="preserve"> was found and deleted.</w:t>
+      </w:r>
+      <w:r>
+        <w:rPr>
+          <w:rFonts w:ascii="Arial" w:hAnsi="Arial" w:cs="Arial"/>
+          <w:color w:val="000000" w:themeColor="text1"/>
+          <w:sz w:val="24"/>
+          <w:szCs w:val="24"/>
+        </w:rPr>
+        <w:t xml:space="preserve"> After this </w:t>
+      </w:r>
+      <w:proofErr w:type="spellStart"/>
+      <w:r>
+        <w:rPr>
+          <w:rFonts w:ascii="Arial" w:hAnsi="Arial" w:cs="Arial"/>
+          <w:color w:val="000000" w:themeColor="text1"/>
+          <w:sz w:val="24"/>
+          <w:szCs w:val="24"/>
+        </w:rPr>
+        <w:t>pop_</w:t>
+      </w:r>
+      <w:proofErr w:type="gramStart"/>
+      <w:r>
+        <w:rPr>
+          <w:rFonts w:ascii="Arial" w:hAnsi="Arial" w:cs="Arial"/>
+          <w:color w:val="000000" w:themeColor="text1"/>
+          <w:sz w:val="24"/>
+          <w:szCs w:val="24"/>
+        </w:rPr>
+        <w:t>back</w:t>
+      </w:r>
+      <w:proofErr w:type="spellEnd"/>
+      <w:r>
+        <w:rPr>
+          <w:rFonts w:ascii="Arial" w:hAnsi="Arial" w:cs="Arial"/>
+          <w:color w:val="000000" w:themeColor="text1"/>
+          <w:sz w:val="24"/>
+          <w:szCs w:val="24"/>
+        </w:rPr>
+        <w:t>(</w:t>
+      </w:r>
+      <w:proofErr w:type="gramEnd"/>
+      <w:r>
+        <w:rPr>
+          <w:rFonts w:ascii="Arial" w:hAnsi="Arial" w:cs="Arial"/>
+          <w:color w:val="000000" w:themeColor="text1"/>
+          <w:sz w:val="24"/>
+          <w:szCs w:val="24"/>
+        </w:rPr>
+        <w:t>) was called on both vectors.</w:t>
+      </w:r>
+    </w:p>
+    <w:p>
+      <w:pPr>
+        <w:spacing w:line="276" w:lineRule="auto"/>
+        <w:rPr>
+          <w:rFonts w:ascii="Arial" w:hAnsi="Arial" w:cs="Arial"/>
+          <w:color w:val="000000" w:themeColor="text1"/>
+          <w:sz w:val="24"/>
+          <w:szCs w:val="24"/>
+        </w:rPr>
+      </w:pPr>
+      <w:r>
+        <w:rPr>
+          <w:rFonts w:ascii="Arial" w:hAnsi="Arial" w:cs="Arial"/>
+          <w:color w:val="000000" w:themeColor="text1"/>
+          <w:sz w:val="24"/>
+          <w:szCs w:val="24"/>
+        </w:rPr>
+        <w:t>While this method worked, it was much more unreliable and</w:t>
+      </w:r>
+      <w:r>
+        <w:rPr>
+          <w:rFonts w:ascii="Arial" w:hAnsi="Arial" w:cs="Arial"/>
+          <w:color w:val="000000" w:themeColor="text1"/>
+          <w:sz w:val="24"/>
+          <w:szCs w:val="24"/>
+        </w:rPr>
+        <w:t xml:space="preserve"> complicated than it needed to be.</w:t>
+      </w:r>
+      <w:r>
+        <w:rPr>
+          <w:rFonts w:ascii="Arial" w:hAnsi="Arial" w:cs="Arial"/>
+          <w:color w:val="000000" w:themeColor="text1"/>
+          <w:sz w:val="24"/>
+          <w:szCs w:val="24"/>
+        </w:rPr>
+        <w:t xml:space="preserve"> It also only worked on creating and deleting objects</w:t>
+      </w:r>
+      <w:r>
+        <w:rPr>
+          <w:rFonts w:ascii="Arial" w:hAnsi="Arial" w:cs="Arial"/>
+          <w:color w:val="000000" w:themeColor="text1"/>
+          <w:sz w:val="24"/>
+          <w:szCs w:val="24"/>
+        </w:rPr>
+        <w:t xml:space="preserve"> which would not work with the object editor function which altered the properties of existing objects without creating or deleting them.</w:t>
+      </w:r>
+      <w:r>
+        <w:rPr>
+          <w:rFonts w:ascii="Arial" w:hAnsi="Arial" w:cs="Arial"/>
+          <w:color w:val="000000" w:themeColor="text1"/>
+          <w:sz w:val="24"/>
+          <w:szCs w:val="24"/>
+        </w:rPr>
+        <w:t xml:space="preserve"> New code would have to be added </w:t>
+      </w:r>
+      <w:r>
+        <w:rPr>
+          <w:rFonts w:ascii="Arial" w:hAnsi="Arial" w:cs="Arial"/>
+          <w:color w:val="000000" w:themeColor="text1"/>
+          <w:sz w:val="24"/>
+          <w:szCs w:val="24"/>
+        </w:rPr>
+        <w:t>for every feature that needed undoing</w:t>
+      </w:r>
+      <w:r>
+        <w:rPr>
+          <w:rFonts w:ascii="Arial" w:hAnsi="Arial" w:cs="Arial"/>
+          <w:color w:val="000000" w:themeColor="text1"/>
+          <w:sz w:val="24"/>
+          <w:szCs w:val="24"/>
+        </w:rPr>
+        <w:t xml:space="preserve">, and a redo function would be difficult to add </w:t>
+      </w:r>
+      <w:r>
+        <w:rPr>
+          <w:rFonts w:ascii="Arial" w:hAnsi="Arial" w:cs="Arial"/>
+          <w:color w:val="000000" w:themeColor="text1"/>
+          <w:sz w:val="24"/>
+          <w:szCs w:val="24"/>
+        </w:rPr>
+        <w:t>with this implementation</w:t>
+      </w:r>
+      <w:r>
+        <w:rPr>
+          <w:rFonts w:ascii="Arial" w:hAnsi="Arial" w:cs="Arial"/>
+          <w:color w:val="000000" w:themeColor="text1"/>
+          <w:sz w:val="24"/>
+          <w:szCs w:val="24"/>
+        </w:rPr>
+        <w:t>.</w:t>
+      </w:r>
+      <w:r>
+        <w:rPr>
+          <w:rFonts w:ascii="Arial" w:hAnsi="Arial" w:cs="Arial"/>
+          <w:color w:val="000000" w:themeColor="text1"/>
+          <w:sz w:val="24"/>
+          <w:szCs w:val="24"/>
+        </w:rPr>
+        <w:t xml:space="preserve"> For these reasons, and the recommendation of my peers, </w:t>
+      </w:r>
+      <w:r>
+        <w:rPr>
+          <w:rFonts w:ascii="Arial" w:hAnsi="Arial" w:cs="Arial"/>
+          <w:color w:val="000000" w:themeColor="text1"/>
+          <w:sz w:val="24"/>
+          <w:szCs w:val="24"/>
+        </w:rPr>
+        <w:t>this</w:t>
+      </w:r>
+      <w:r>
+        <w:rPr>
+          <w:rFonts w:ascii="Arial" w:hAnsi="Arial" w:cs="Arial"/>
+          <w:color w:val="000000" w:themeColor="text1"/>
+          <w:sz w:val="24"/>
+          <w:szCs w:val="24"/>
+        </w:rPr>
+        <w:t xml:space="preserve"> undo function was</w:t>
+      </w:r>
+      <w:r>
+        <w:rPr>
+          <w:rFonts w:ascii="Arial" w:hAnsi="Arial" w:cs="Arial"/>
+          <w:color w:val="000000" w:themeColor="text1"/>
+          <w:sz w:val="24"/>
+          <w:szCs w:val="24"/>
+        </w:rPr>
+        <w:t xml:space="preserve"> scrapped</w:t>
+      </w:r>
+      <w:r>
+        <w:rPr>
+          <w:rFonts w:ascii="Arial" w:hAnsi="Arial" w:cs="Arial"/>
+          <w:color w:val="000000" w:themeColor="text1"/>
+          <w:sz w:val="24"/>
+          <w:szCs w:val="24"/>
+        </w:rPr>
+        <w:t xml:space="preserve"> in favour of a much more reliable and scalable one.</w:t>
+      </w:r>
+    </w:p>
+    <w:p>
+      <w:pPr>
         <w:spacing w:line="276" w:lineRule="auto"/>
         <w:rPr>
           <w:rFonts w:ascii="Arial" w:hAnsi="Arial" w:cs="Arial"/>
           <w:b/>
           <w:bCs/>
           <w:color w:val="000000" w:themeColor="text1"/>
-          <w:sz w:val="26"/>
-          <w:szCs w:val="26"/>
-        </w:rPr>
-      </w:pPr>
-      <w:r>
+          <w:sz w:val="24"/>
+          <w:szCs w:val="24"/>
+        </w:rPr>
+      </w:pPr>
+    </w:p>
+    <w:p>
+      <w:pPr>
+        <w:pStyle w:val="Heading2"/>
         <w:rPr>
           <w:rFonts w:ascii="Arial" w:hAnsi="Arial" w:cs="Arial"/>
           <w:b/>
           <w:bCs/>
           <w:color w:val="000000" w:themeColor="text1"/>
-          <w:sz w:val="26"/>
-          <w:szCs w:val="26"/>
+          <w:sz w:val="24"/>
+          <w:szCs w:val="24"/>
+        </w:rPr>
+      </w:pPr>
+      <w:r>
+        <w:rPr>
+          <w:rFonts w:ascii="Arial" w:hAnsi="Arial" w:cs="Arial"/>
+          <w:b/>
+          <w:bCs/>
+          <w:color w:val="000000" w:themeColor="text1"/>
+          <w:sz w:val="24"/>
+          <w:szCs w:val="24"/>
+        </w:rPr>
+        <w:lastRenderedPageBreak/>
+        <w:t>Updated</w:t>
+      </w:r>
+      <w:r>
+        <w:rPr>
+          <w:rFonts w:ascii="Arial" w:hAnsi="Arial" w:cs="Arial"/>
+          <w:b/>
+          <w:bCs/>
+          <w:color w:val="000000" w:themeColor="text1"/>
+          <w:sz w:val="24"/>
+          <w:szCs w:val="24"/>
+        </w:rPr>
+        <w:t xml:space="preserve"> </w:t>
+      </w:r>
+      <w:r>
+        <w:rPr>
+          <w:rFonts w:ascii="Arial" w:hAnsi="Arial" w:cs="Arial"/>
+          <w:b/>
+          <w:bCs/>
+          <w:color w:val="000000" w:themeColor="text1"/>
+          <w:sz w:val="24"/>
+          <w:szCs w:val="24"/>
+        </w:rPr>
+        <w:t>Undo</w:t>
+      </w:r>
+    </w:p>
+    <w:p>
+      <w:pPr>
+        <w:spacing w:line="276" w:lineRule="auto"/>
+        <w:rPr>
+          <w:rFonts w:ascii="Arial" w:hAnsi="Arial" w:cs="Arial"/>
+          <w:color w:val="000000" w:themeColor="text1"/>
+          <w:sz w:val="24"/>
+          <w:szCs w:val="24"/>
+        </w:rPr>
+      </w:pPr>
+    </w:p>
+    <w:p>
+      <w:pPr>
+        <w:spacing w:line="276" w:lineRule="auto"/>
+        <w:rPr>
+          <w:rFonts w:ascii="Arial" w:hAnsi="Arial" w:cs="Arial"/>
+          <w:color w:val="000000" w:themeColor="text1"/>
+          <w:sz w:val="24"/>
+          <w:szCs w:val="24"/>
+        </w:rPr>
+      </w:pPr>
+    </w:p>
+    <w:p>
+      <w:pPr>
+        <w:pStyle w:val="Heading1"/>
+        <w:spacing w:line="276" w:lineRule="auto"/>
+        <w:rPr>
+          <w:rFonts w:ascii="Arial" w:hAnsi="Arial" w:cs="Arial"/>
+          <w:b/>
+          <w:bCs/>
+          <w:color w:val="000000" w:themeColor="text1"/>
+          <w:sz w:val="28"/>
+          <w:szCs w:val="28"/>
+        </w:rPr>
+      </w:pPr>
+      <w:r>
+        <w:rPr>
+          <w:rFonts w:ascii="Arial" w:hAnsi="Arial" w:cs="Arial"/>
+          <w:b/>
+          <w:bCs/>
+          <w:color w:val="000000" w:themeColor="text1"/>
+          <w:sz w:val="28"/>
+          <w:szCs w:val="28"/>
+        </w:rPr>
+        <w:t>Object Editor:</w:t>
+      </w:r>
+    </w:p>
+    <w:p>
+      <w:pPr>
+        <w:spacing w:line="276" w:lineRule="auto"/>
+        <w:rPr>
+          <w:rFonts w:ascii="Arial" w:hAnsi="Arial" w:cs="Arial"/>
+          <w:color w:val="000000" w:themeColor="text1"/>
+          <w:sz w:val="28"/>
+          <w:szCs w:val="28"/>
+        </w:rPr>
+      </w:pPr>
+    </w:p>
+    <w:p>
+      <w:pPr>
+        <w:spacing w:line="276" w:lineRule="auto"/>
+        <w:rPr>
+          <w:rFonts w:ascii="Arial" w:hAnsi="Arial" w:cs="Arial"/>
+          <w:color w:val="000000" w:themeColor="text1"/>
+          <w:sz w:val="28"/>
+          <w:szCs w:val="28"/>
+        </w:rPr>
+      </w:pPr>
+    </w:p>
+    <w:p>
+      <w:pPr>
+        <w:pStyle w:val="Heading1"/>
+        <w:spacing w:line="276" w:lineRule="auto"/>
+        <w:rPr>
+          <w:rFonts w:ascii="Arial" w:hAnsi="Arial" w:cs="Arial"/>
+          <w:b/>
+          <w:bCs/>
+          <w:color w:val="000000" w:themeColor="text1"/>
+          <w:sz w:val="28"/>
+          <w:szCs w:val="28"/>
+        </w:rPr>
+      </w:pPr>
+      <w:r>
+        <w:rPr>
+          <w:rFonts w:ascii="Arial" w:hAnsi="Arial" w:cs="Arial"/>
+          <w:b/>
+          <w:bCs/>
+          <w:color w:val="000000" w:themeColor="text1"/>
+          <w:sz w:val="28"/>
+          <w:szCs w:val="28"/>
         </w:rPr>
         <w:t>Conclusion:</w:t>
       </w:r>
@@ -1064,18 +2849,20 @@
         <w:spacing w:line="276" w:lineRule="auto"/>
         <w:rPr>
           <w:rFonts w:ascii="Arial" w:hAnsi="Arial" w:cs="Arial"/>
-          <w:sz w:val="26"/>
-          <w:szCs w:val="26"/>
-        </w:rPr>
-      </w:pPr>
-    </w:p>
-    <w:p>
-      <w:pPr>
-        <w:spacing w:line="276" w:lineRule="auto"/>
-        <w:rPr>
-          <w:rFonts w:ascii="Arial" w:hAnsi="Arial" w:cs="Arial"/>
-          <w:sz w:val="26"/>
-          <w:szCs w:val="26"/>
+          <w:color w:val="000000" w:themeColor="text1"/>
+          <w:sz w:val="24"/>
+          <w:szCs w:val="24"/>
+        </w:rPr>
+      </w:pPr>
+    </w:p>
+    <w:p>
+      <w:pPr>
+        <w:spacing w:line="276" w:lineRule="auto"/>
+        <w:rPr>
+          <w:rFonts w:ascii="Arial" w:hAnsi="Arial" w:cs="Arial"/>
+          <w:color w:val="000000" w:themeColor="text1"/>
+          <w:sz w:val="24"/>
+          <w:szCs w:val="24"/>
         </w:rPr>
       </w:pPr>
     </w:p>
@@ -1517,7 +3304,6 @@
     <w:next w:val="Normal"/>
     <w:link w:val="Heading2Char"/>
     <w:uiPriority w:val="9"/>
-    <w:semiHidden/>
     <w:unhideWhenUsed/>
     <w:qFormat/>
     <w:rsid w:val="00836D5C"/>
@@ -1733,7 +3519,6 @@
     <w:basedOn w:val="DefaultParagraphFont"/>
     <w:link w:val="Heading2"/>
     <w:uiPriority w:val="9"/>
-    <w:semiHidden/>
     <w:rsid w:val="00836D5C"/>
     <w:rPr>
       <w:rFonts w:asciiTheme="majorHAnsi" w:eastAsiaTheme="majorEastAsia" w:hAnsiTheme="majorHAnsi" w:cstheme="majorBidi"/>
@@ -2003,6 +3788,25 @@
       <w:smallCaps/>
       <w:color w:val="0F4761" w:themeColor="accent1" w:themeShade="BF"/>
       <w:spacing w:val="5"/>
+    </w:rPr>
+  </w:style>
+  <w:style w:type="paragraph" w:styleId="Caption">
+    <w:name w:val="caption"/>
+    <w:basedOn w:val="Normal"/>
+    <w:next w:val="Normal"/>
+    <w:uiPriority w:val="35"/>
+    <w:unhideWhenUsed/>
+    <w:qFormat/>
+    <w:rsid w:val="003E0F47"/>
+    <w:pPr>
+      <w:spacing w:after="200" w:line="240" w:lineRule="auto"/>
+    </w:pPr>
+    <w:rPr>
+      <w:i/>
+      <w:iCs/>
+      <w:color w:val="0E2841" w:themeColor="text2"/>
+      <w:sz w:val="18"/>
+      <w:szCs w:val="18"/>
     </w:rPr>
   </w:style>
 </w:styles>
@@ -2301,4 +4105,16 @@
     </a:ext>
   </a:extLst>
 </a:theme>
+</file>
+
+<file path=customXml/item1.xml><?xml version="1.0" encoding="utf-8"?>
+<b:Sources xmlns:b="http://schemas.openxmlformats.org/officeDocument/2006/bibliography" xmlns="http://schemas.openxmlformats.org/officeDocument/2006/bibliography" SelectedStyle="\APASixthEditionOfficeOnline.xsl" StyleName="APA" Version="6"/>
+</file>
+
+<file path=customXml/itemProps1.xml><?xml version="1.0" encoding="utf-8"?>
+<ds:datastoreItem xmlns:ds="http://schemas.openxmlformats.org/officeDocument/2006/customXml" ds:itemID="{065D0367-AD81-4618-882F-824ED127F596}">
+  <ds:schemaRefs>
+    <ds:schemaRef ds:uri="http://schemas.openxmlformats.org/officeDocument/2006/bibliography"/>
+  </ds:schemaRefs>
+</ds:datastoreItem>
 </file>
</xml_diff>